<commit_message>
Inserito Sommario e modifica nome
</commit_message>
<xml_diff>
--- a/docs/analisi-funzionale/AF_TeamFit_ManAgent_MVP_2026-06-20.docx
+++ b/docs/analisi-funzionale/AF_TeamFit_ManAgent_MVP_2026-06-20.docx
@@ -11,9 +11,9 @@
           <w:noProof/>
         </w:rPr>
         <w:drawing>
-          <wp:inline distT="0" distB="0" distL="0" distR="0" wp14:anchorId="213D503B" wp14:editId="35B175F7">
-            <wp:extent cx="2194560" cy="5760720"/>
-            <wp:effectExtent l="0" t="0" r="0" b="0"/>
+          <wp:inline distT="0" distB="0" distL="0" distR="0" wp14:anchorId="213D503B" wp14:editId="5F7B2979">
+            <wp:extent cx="3671454" cy="4087091"/>
+            <wp:effectExtent l="0" t="0" r="5715" b="8890"/>
             <wp:docPr id="19348635" name="Picture 1"/>
             <wp:cNvGraphicFramePr/>
             <a:graphic xmlns:a="http://schemas.openxmlformats.org/drawingml/2006/main">
@@ -24,7 +24,7 @@
                     <pic:cNvPicPr/>
                   </pic:nvPicPr>
                   <pic:blipFill>
-                    <a:blip r:embed="rId4">
+                    <a:blip r:embed="rId4" cstate="print">
                       <a:extLst>
                         <a:ext uri="{28A0092B-C50C-407E-A947-70E740481C1C}">
                           <a14:useLocalDpi xmlns:a14="http://schemas.microsoft.com/office/drawing/2010/main" val="0"/>
@@ -38,7 +38,7 @@
                   <pic:spPr>
                     <a:xfrm>
                       <a:off x="0" y="0"/>
-                      <a:ext cx="2194560" cy="5760720"/>
+                      <a:ext cx="3683837" cy="4100876"/>
                     </a:xfrm>
                     <a:prstGeom prst="rect">
                       <a:avLst/>
@@ -49,59 +49,6 @@
             </a:graphic>
           </wp:inline>
         </w:drawing>
-      </w:r>
-    </w:p>
-    <w:p>
-      <w:pPr>
-        <w:jc w:val="center"/>
-      </w:pPr>
-    </w:p>
-    <w:p>
-      <w:pPr>
-        <w:jc w:val="center"/>
-        <w:rPr>
-          <w:rFonts w:cs="Calibri"/>
-          <w:color w:val="808080"/>
-          <w:sz w:val="18"/>
-        </w:rPr>
-      </w:pPr>
-      <w:r>
-        <w:rPr>
-          <w:rFonts w:cs="Calibri"/>
-          <w:color w:val="808080"/>
-          <w:sz w:val="18"/>
-        </w:rPr>
-        <w:t>ANALISI FUNZIONALE  -  DOCUMENTO INTERNO</w:t>
-      </w:r>
-    </w:p>
-    <w:p>
-      <w:pPr>
-        <w:jc w:val="center"/>
-        <w:rPr>
-          <w:rFonts w:cs="Calibri"/>
-          <w:color w:val="808080"/>
-          <w:sz w:val="18"/>
-        </w:rPr>
-      </w:pPr>
-    </w:p>
-    <w:p>
-      <w:pPr>
-        <w:jc w:val="center"/>
-        <w:rPr>
-          <w:rFonts w:cs="Calibri"/>
-          <w:b/>
-          <w:color w:val="1F3864"/>
-          <w:sz w:val="72"/>
-        </w:rPr>
-      </w:pPr>
-      <w:r>
-        <w:rPr>
-          <w:rFonts w:cs="Calibri"/>
-          <w:b/>
-          <w:color w:val="1F3864"/>
-          <w:sz w:val="72"/>
-        </w:rPr>
-        <w:t>Man-Agent</w:t>
       </w:r>
     </w:p>
     <w:p>
@@ -138,6 +85,34 @@
           <w:sz w:val="30"/>
         </w:rPr>
         <w:t>dei progetti aziendali</w:t>
+      </w:r>
+    </w:p>
+    <w:p>
+      <w:pPr>
+        <w:jc w:val="center"/>
+        <w:rPr>
+          <w:rFonts w:cs="Calibri"/>
+          <w:color w:val="808080"/>
+          <w:sz w:val="30"/>
+        </w:rPr>
+      </w:pPr>
+    </w:p>
+    <w:p>
+      <w:pPr>
+        <w:jc w:val="center"/>
+        <w:rPr>
+          <w:rFonts w:cs="Calibri"/>
+          <w:color w:val="808080"/>
+          <w:sz w:val="18"/>
+        </w:rPr>
+      </w:pPr>
+      <w:r>
+        <w:rPr>
+          <w:rFonts w:cs="Calibri"/>
+          <w:color w:val="808080"/>
+          <w:sz w:val="18"/>
+        </w:rPr>
+        <w:t>ANALISI FUNZIONALE  -  DOCUMENTO INTERNO</w:t>
       </w:r>
     </w:p>
     <w:p>
@@ -212,7 +187,7 @@
     </w:p>
     <w:tbl>
       <w:tblPr>
-        <w:tblStyle w:val="TableGrid"/>
+        <w:tblStyle w:val="Grigliatabella"/>
         <w:tblW w:w="0" w:type="auto"/>
         <w:tblBorders>
           <w:insideH w:val="none" w:sz="0" w:space="0" w:color="auto"/>
@@ -246,6 +221,7 @@
                 <w:color w:val="1F3864"/>
                 <w:sz w:val="20"/>
               </w:rPr>
+              <w:lastRenderedPageBreak/>
               <w:t>Versione</w:t>
             </w:r>
           </w:p>
@@ -364,7 +340,15 @@
                 <w:color w:val="808080"/>
                 <w:sz w:val="20"/>
               </w:rPr>
-              <w:t>Man-Agent MVP</w:t>
+              <w:t>TeamFit</w:t>
+            </w:r>
+            <w:r>
+              <w:rPr>
+                <w:rFonts w:cs="Calibri"/>
+                <w:color w:val="808080"/>
+                <w:sz w:val="20"/>
+              </w:rPr>
+              <w:t xml:space="preserve"> MVP</w:t>
             </w:r>
           </w:p>
         </w:tc>
@@ -426,18 +410,20 @@
     </w:p>
     <w:p>
       <w:pPr>
-        <w:pStyle w:val="Heading1"/>
+        <w:pStyle w:val="Titolo1"/>
       </w:pPr>
       <w:bookmarkStart w:id="0" w:name="_Toc232859546"/>
+      <w:bookmarkStart w:id="1" w:name="_Toc232860159"/>
       <w:r>
         <w:lastRenderedPageBreak/>
         <w:t>Revisioni</w:t>
       </w:r>
       <w:bookmarkEnd w:id="0"/>
+      <w:bookmarkEnd w:id="1"/>
     </w:p>
     <w:tbl>
       <w:tblPr>
-        <w:tblStyle w:val="TableGrid"/>
+        <w:tblStyle w:val="Grigliatabella"/>
         <w:tblW w:w="9360" w:type="dxa"/>
         <w:tblLayout w:type="fixed"/>
         <w:tblLook w:val="04A0" w:firstRow="1" w:lastRow="0" w:firstColumn="1" w:lastColumn="0" w:noHBand="0" w:noVBand="1"/>
@@ -651,17 +637,2703 @@
         <w:br w:type="page"/>
       </w:r>
     </w:p>
-    <w:p>
-      <w:pPr>
-        <w:pStyle w:val="Heading1"/>
-      </w:pPr>
-      <w:bookmarkStart w:id="1" w:name="_Toc232859547"/>
-      <w:r>
-        <w:lastRenderedPageBreak/>
-        <w:t>Indice</w:t>
-      </w:r>
-      <w:bookmarkEnd w:id="1"/>
-    </w:p>
+    <w:sdt>
+      <w:sdtPr>
+        <w:id w:val="1040558059"/>
+        <w:docPartObj>
+          <w:docPartGallery w:val="Table of Contents"/>
+          <w:docPartUnique/>
+        </w:docPartObj>
+      </w:sdtPr>
+      <w:sdtEndPr>
+        <w:rPr>
+          <w:rFonts w:ascii="Calibri" w:eastAsiaTheme="minorHAnsi" w:hAnsi="Calibri" w:cstheme="minorBidi"/>
+          <w:b/>
+          <w:bCs/>
+          <w:color w:val="000000"/>
+          <w:kern w:val="2"/>
+          <w:sz w:val="22"/>
+          <w:szCs w:val="24"/>
+          <w:lang w:val="en-US" w:eastAsia="en-US"/>
+          <w14:ligatures w14:val="standardContextual"/>
+        </w:rPr>
+      </w:sdtEndPr>
+      <w:sdtContent>
+        <w:p>
+          <w:pPr>
+            <w:pStyle w:val="Titolosommario"/>
+          </w:pPr>
+          <w:r>
+            <w:t>Sommario</w:t>
+          </w:r>
+        </w:p>
+        <w:p>
+          <w:pPr>
+            <w:rPr>
+              <w:lang w:val="it-IT" w:eastAsia="it-IT"/>
+            </w:rPr>
+          </w:pPr>
+        </w:p>
+        <w:p>
+          <w:pPr>
+            <w:pStyle w:val="Sommario1"/>
+            <w:tabs>
+              <w:tab w:val="right" w:leader="dot" w:pos="9062"/>
+            </w:tabs>
+            <w:rPr>
+              <w:rFonts w:asciiTheme="minorHAnsi" w:eastAsiaTheme="minorEastAsia" w:hAnsiTheme="minorHAnsi"/>
+              <w:noProof/>
+              <w:color w:val="auto"/>
+              <w:sz w:val="24"/>
+              <w:lang w:val="it-IT" w:eastAsia="it-IT"/>
+            </w:rPr>
+          </w:pPr>
+          <w:r>
+            <w:fldChar w:fldCharType="begin"/>
+          </w:r>
+          <w:r>
+            <w:instrText xml:space="preserve"> TOC \o "1-3" \h \z \u </w:instrText>
+          </w:r>
+          <w:r>
+            <w:fldChar w:fldCharType="separate"/>
+          </w:r>
+          <w:hyperlink w:anchor="_Toc232860159" w:history="1">
+            <w:r>
+              <w:rPr>
+                <w:rStyle w:val="Collegamentoipertestuale"/>
+                <w:noProof/>
+              </w:rPr>
+              <w:t>Revisioni</w:t>
+            </w:r>
+            <w:r>
+              <w:rPr>
+                <w:noProof/>
+                <w:webHidden/>
+              </w:rPr>
+              <w:tab/>
+            </w:r>
+            <w:r>
+              <w:rPr>
+                <w:noProof/>
+                <w:webHidden/>
+              </w:rPr>
+              <w:fldChar w:fldCharType="begin"/>
+            </w:r>
+            <w:r>
+              <w:rPr>
+                <w:noProof/>
+                <w:webHidden/>
+              </w:rPr>
+              <w:instrText xml:space="preserve"> PAGEREF _Toc232860159 \h </w:instrText>
+            </w:r>
+            <w:r>
+              <w:rPr>
+                <w:noProof/>
+                <w:webHidden/>
+              </w:rPr>
+            </w:r>
+            <w:r>
+              <w:rPr>
+                <w:noProof/>
+                <w:webHidden/>
+              </w:rPr>
+              <w:fldChar w:fldCharType="separate"/>
+            </w:r>
+            <w:r>
+              <w:rPr>
+                <w:noProof/>
+                <w:webHidden/>
+              </w:rPr>
+              <w:t>3</w:t>
+            </w:r>
+            <w:r>
+              <w:rPr>
+                <w:noProof/>
+                <w:webHidden/>
+              </w:rPr>
+              <w:fldChar w:fldCharType="end"/>
+            </w:r>
+          </w:hyperlink>
+        </w:p>
+        <w:p>
+          <w:pPr>
+            <w:pStyle w:val="Sommario1"/>
+            <w:tabs>
+              <w:tab w:val="right" w:leader="dot" w:pos="9062"/>
+            </w:tabs>
+            <w:rPr>
+              <w:rFonts w:asciiTheme="minorHAnsi" w:eastAsiaTheme="minorEastAsia" w:hAnsiTheme="minorHAnsi"/>
+              <w:noProof/>
+              <w:color w:val="auto"/>
+              <w:sz w:val="24"/>
+              <w:lang w:val="it-IT" w:eastAsia="it-IT"/>
+            </w:rPr>
+          </w:pPr>
+          <w:hyperlink w:anchor="_Toc232860160" w:history="1">
+            <w:r>
+              <w:rPr>
+                <w:rStyle w:val="Collegamentoipertestuale"/>
+                <w:noProof/>
+              </w:rPr>
+              <w:t>1. Executive Summary</w:t>
+            </w:r>
+            <w:r>
+              <w:rPr>
+                <w:noProof/>
+                <w:webHidden/>
+              </w:rPr>
+              <w:tab/>
+            </w:r>
+            <w:r>
+              <w:rPr>
+                <w:noProof/>
+                <w:webHidden/>
+              </w:rPr>
+              <w:fldChar w:fldCharType="begin"/>
+            </w:r>
+            <w:r>
+              <w:rPr>
+                <w:noProof/>
+                <w:webHidden/>
+              </w:rPr>
+              <w:instrText xml:space="preserve"> PAGEREF _Toc232860160 \h </w:instrText>
+            </w:r>
+            <w:r>
+              <w:rPr>
+                <w:noProof/>
+                <w:webHidden/>
+              </w:rPr>
+            </w:r>
+            <w:r>
+              <w:rPr>
+                <w:noProof/>
+                <w:webHidden/>
+              </w:rPr>
+              <w:fldChar w:fldCharType="separate"/>
+            </w:r>
+            <w:r>
+              <w:rPr>
+                <w:noProof/>
+                <w:webHidden/>
+              </w:rPr>
+              <w:t>6</w:t>
+            </w:r>
+            <w:r>
+              <w:rPr>
+                <w:noProof/>
+                <w:webHidden/>
+              </w:rPr>
+              <w:fldChar w:fldCharType="end"/>
+            </w:r>
+          </w:hyperlink>
+        </w:p>
+        <w:p>
+          <w:pPr>
+            <w:pStyle w:val="Sommario1"/>
+            <w:tabs>
+              <w:tab w:val="right" w:leader="dot" w:pos="9062"/>
+            </w:tabs>
+            <w:rPr>
+              <w:rFonts w:asciiTheme="minorHAnsi" w:eastAsiaTheme="minorEastAsia" w:hAnsiTheme="minorHAnsi"/>
+              <w:noProof/>
+              <w:color w:val="auto"/>
+              <w:sz w:val="24"/>
+              <w:lang w:val="it-IT" w:eastAsia="it-IT"/>
+            </w:rPr>
+          </w:pPr>
+          <w:hyperlink w:anchor="_Toc232860161" w:history="1">
+            <w:r>
+              <w:rPr>
+                <w:rStyle w:val="Collegamentoipertestuale"/>
+                <w:noProof/>
+              </w:rPr>
+              <w:t>2. Scope</w:t>
+            </w:r>
+            <w:r>
+              <w:rPr>
+                <w:noProof/>
+                <w:webHidden/>
+              </w:rPr>
+              <w:tab/>
+            </w:r>
+            <w:r>
+              <w:rPr>
+                <w:noProof/>
+                <w:webHidden/>
+              </w:rPr>
+              <w:fldChar w:fldCharType="begin"/>
+            </w:r>
+            <w:r>
+              <w:rPr>
+                <w:noProof/>
+                <w:webHidden/>
+              </w:rPr>
+              <w:instrText xml:space="preserve"> PAGEREF _Toc232860161 \h </w:instrText>
+            </w:r>
+            <w:r>
+              <w:rPr>
+                <w:noProof/>
+                <w:webHidden/>
+              </w:rPr>
+            </w:r>
+            <w:r>
+              <w:rPr>
+                <w:noProof/>
+                <w:webHidden/>
+              </w:rPr>
+              <w:fldChar w:fldCharType="separate"/>
+            </w:r>
+            <w:r>
+              <w:rPr>
+                <w:noProof/>
+                <w:webHidden/>
+              </w:rPr>
+              <w:t>6</w:t>
+            </w:r>
+            <w:r>
+              <w:rPr>
+                <w:noProof/>
+                <w:webHidden/>
+              </w:rPr>
+              <w:fldChar w:fldCharType="end"/>
+            </w:r>
+          </w:hyperlink>
+        </w:p>
+        <w:p>
+          <w:pPr>
+            <w:pStyle w:val="Sommario2"/>
+            <w:tabs>
+              <w:tab w:val="right" w:leader="dot" w:pos="9062"/>
+            </w:tabs>
+            <w:rPr>
+              <w:noProof/>
+            </w:rPr>
+          </w:pPr>
+          <w:hyperlink w:anchor="_Toc232860162" w:history="1">
+            <w:r>
+              <w:rPr>
+                <w:rStyle w:val="Collegamentoipertestuale"/>
+                <w:noProof/>
+              </w:rPr>
+              <w:t>2.1  In Scope  -  MVP</w:t>
+            </w:r>
+            <w:r>
+              <w:rPr>
+                <w:noProof/>
+                <w:webHidden/>
+              </w:rPr>
+              <w:tab/>
+            </w:r>
+            <w:r>
+              <w:rPr>
+                <w:noProof/>
+                <w:webHidden/>
+              </w:rPr>
+              <w:fldChar w:fldCharType="begin"/>
+            </w:r>
+            <w:r>
+              <w:rPr>
+                <w:noProof/>
+                <w:webHidden/>
+              </w:rPr>
+              <w:instrText xml:space="preserve"> PAGEREF _Toc232860162 \h </w:instrText>
+            </w:r>
+            <w:r>
+              <w:rPr>
+                <w:noProof/>
+                <w:webHidden/>
+              </w:rPr>
+            </w:r>
+            <w:r>
+              <w:rPr>
+                <w:noProof/>
+                <w:webHidden/>
+              </w:rPr>
+              <w:fldChar w:fldCharType="separate"/>
+            </w:r>
+            <w:r>
+              <w:rPr>
+                <w:noProof/>
+                <w:webHidden/>
+              </w:rPr>
+              <w:t>6</w:t>
+            </w:r>
+            <w:r>
+              <w:rPr>
+                <w:noProof/>
+                <w:webHidden/>
+              </w:rPr>
+              <w:fldChar w:fldCharType="end"/>
+            </w:r>
+          </w:hyperlink>
+        </w:p>
+        <w:p>
+          <w:pPr>
+            <w:pStyle w:val="Sommario2"/>
+            <w:tabs>
+              <w:tab w:val="right" w:leader="dot" w:pos="9062"/>
+            </w:tabs>
+            <w:rPr>
+              <w:noProof/>
+            </w:rPr>
+          </w:pPr>
+          <w:hyperlink w:anchor="_Toc232860163" w:history="1">
+            <w:r>
+              <w:rPr>
+                <w:rStyle w:val="Collegamentoipertestuale"/>
+                <w:noProof/>
+              </w:rPr>
+              <w:t>2.2  Out of Scope  -  MVP</w:t>
+            </w:r>
+            <w:r>
+              <w:rPr>
+                <w:noProof/>
+                <w:webHidden/>
+              </w:rPr>
+              <w:tab/>
+            </w:r>
+            <w:r>
+              <w:rPr>
+                <w:noProof/>
+                <w:webHidden/>
+              </w:rPr>
+              <w:fldChar w:fldCharType="begin"/>
+            </w:r>
+            <w:r>
+              <w:rPr>
+                <w:noProof/>
+                <w:webHidden/>
+              </w:rPr>
+              <w:instrText xml:space="preserve"> PAGEREF _Toc232860163 \h </w:instrText>
+            </w:r>
+            <w:r>
+              <w:rPr>
+                <w:noProof/>
+                <w:webHidden/>
+              </w:rPr>
+            </w:r>
+            <w:r>
+              <w:rPr>
+                <w:noProof/>
+                <w:webHidden/>
+              </w:rPr>
+              <w:fldChar w:fldCharType="separate"/>
+            </w:r>
+            <w:r>
+              <w:rPr>
+                <w:noProof/>
+                <w:webHidden/>
+              </w:rPr>
+              <w:t>6</w:t>
+            </w:r>
+            <w:r>
+              <w:rPr>
+                <w:noProof/>
+                <w:webHidden/>
+              </w:rPr>
+              <w:fldChar w:fldCharType="end"/>
+            </w:r>
+          </w:hyperlink>
+        </w:p>
+        <w:p>
+          <w:pPr>
+            <w:pStyle w:val="Sommario1"/>
+            <w:tabs>
+              <w:tab w:val="right" w:leader="dot" w:pos="9062"/>
+            </w:tabs>
+            <w:rPr>
+              <w:rFonts w:asciiTheme="minorHAnsi" w:eastAsiaTheme="minorEastAsia" w:hAnsiTheme="minorHAnsi"/>
+              <w:noProof/>
+              <w:color w:val="auto"/>
+              <w:sz w:val="24"/>
+              <w:lang w:val="it-IT" w:eastAsia="it-IT"/>
+            </w:rPr>
+          </w:pPr>
+          <w:hyperlink w:anchor="_Toc232860164" w:history="1">
+            <w:r>
+              <w:rPr>
+                <w:rStyle w:val="Collegamentoipertestuale"/>
+                <w:noProof/>
+              </w:rPr>
+              <w:t>3. Glossario</w:t>
+            </w:r>
+            <w:r>
+              <w:rPr>
+                <w:noProof/>
+                <w:webHidden/>
+              </w:rPr>
+              <w:tab/>
+            </w:r>
+            <w:r>
+              <w:rPr>
+                <w:noProof/>
+                <w:webHidden/>
+              </w:rPr>
+              <w:fldChar w:fldCharType="begin"/>
+            </w:r>
+            <w:r>
+              <w:rPr>
+                <w:noProof/>
+                <w:webHidden/>
+              </w:rPr>
+              <w:instrText xml:space="preserve"> PAGEREF _Toc232860164 \h </w:instrText>
+            </w:r>
+            <w:r>
+              <w:rPr>
+                <w:noProof/>
+                <w:webHidden/>
+              </w:rPr>
+            </w:r>
+            <w:r>
+              <w:rPr>
+                <w:noProof/>
+                <w:webHidden/>
+              </w:rPr>
+              <w:fldChar w:fldCharType="separate"/>
+            </w:r>
+            <w:r>
+              <w:rPr>
+                <w:noProof/>
+                <w:webHidden/>
+              </w:rPr>
+              <w:t>8</w:t>
+            </w:r>
+            <w:r>
+              <w:rPr>
+                <w:noProof/>
+                <w:webHidden/>
+              </w:rPr>
+              <w:fldChar w:fldCharType="end"/>
+            </w:r>
+          </w:hyperlink>
+        </w:p>
+        <w:p>
+          <w:pPr>
+            <w:pStyle w:val="Sommario1"/>
+            <w:tabs>
+              <w:tab w:val="right" w:leader="dot" w:pos="9062"/>
+            </w:tabs>
+            <w:rPr>
+              <w:rFonts w:asciiTheme="minorHAnsi" w:eastAsiaTheme="minorEastAsia" w:hAnsiTheme="minorHAnsi"/>
+              <w:noProof/>
+              <w:color w:val="auto"/>
+              <w:sz w:val="24"/>
+              <w:lang w:val="it-IT" w:eastAsia="it-IT"/>
+            </w:rPr>
+          </w:pPr>
+          <w:hyperlink w:anchor="_Toc232860165" w:history="1">
+            <w:r>
+              <w:rPr>
+                <w:rStyle w:val="Collegamentoipertestuale"/>
+                <w:noProof/>
+              </w:rPr>
+              <w:t>4. Attori e Ruoli</w:t>
+            </w:r>
+            <w:r>
+              <w:rPr>
+                <w:noProof/>
+                <w:webHidden/>
+              </w:rPr>
+              <w:tab/>
+            </w:r>
+            <w:r>
+              <w:rPr>
+                <w:noProof/>
+                <w:webHidden/>
+              </w:rPr>
+              <w:fldChar w:fldCharType="begin"/>
+            </w:r>
+            <w:r>
+              <w:rPr>
+                <w:noProof/>
+                <w:webHidden/>
+              </w:rPr>
+              <w:instrText xml:space="preserve"> PAGEREF _Toc232860165 \h </w:instrText>
+            </w:r>
+            <w:r>
+              <w:rPr>
+                <w:noProof/>
+                <w:webHidden/>
+              </w:rPr>
+            </w:r>
+            <w:r>
+              <w:rPr>
+                <w:noProof/>
+                <w:webHidden/>
+              </w:rPr>
+              <w:fldChar w:fldCharType="separate"/>
+            </w:r>
+            <w:r>
+              <w:rPr>
+                <w:noProof/>
+                <w:webHidden/>
+              </w:rPr>
+              <w:t>9</w:t>
+            </w:r>
+            <w:r>
+              <w:rPr>
+                <w:noProof/>
+                <w:webHidden/>
+              </w:rPr>
+              <w:fldChar w:fldCharType="end"/>
+            </w:r>
+          </w:hyperlink>
+        </w:p>
+        <w:p>
+          <w:pPr>
+            <w:pStyle w:val="Sommario2"/>
+            <w:tabs>
+              <w:tab w:val="right" w:leader="dot" w:pos="9062"/>
+            </w:tabs>
+            <w:rPr>
+              <w:noProof/>
+            </w:rPr>
+          </w:pPr>
+          <w:hyperlink w:anchor="_Toc232860166" w:history="1">
+            <w:r>
+              <w:rPr>
+                <w:rStyle w:val="Collegamentoipertestuale"/>
+                <w:noProof/>
+              </w:rPr>
+              <w:t>4.1  Matrice permessi</w:t>
+            </w:r>
+            <w:r>
+              <w:rPr>
+                <w:noProof/>
+                <w:webHidden/>
+              </w:rPr>
+              <w:tab/>
+            </w:r>
+            <w:r>
+              <w:rPr>
+                <w:noProof/>
+                <w:webHidden/>
+              </w:rPr>
+              <w:fldChar w:fldCharType="begin"/>
+            </w:r>
+            <w:r>
+              <w:rPr>
+                <w:noProof/>
+                <w:webHidden/>
+              </w:rPr>
+              <w:instrText xml:space="preserve"> PAGEREF _Toc232860166 \h </w:instrText>
+            </w:r>
+            <w:r>
+              <w:rPr>
+                <w:noProof/>
+                <w:webHidden/>
+              </w:rPr>
+            </w:r>
+            <w:r>
+              <w:rPr>
+                <w:noProof/>
+                <w:webHidden/>
+              </w:rPr>
+              <w:fldChar w:fldCharType="separate"/>
+            </w:r>
+            <w:r>
+              <w:rPr>
+                <w:noProof/>
+                <w:webHidden/>
+              </w:rPr>
+              <w:t>9</w:t>
+            </w:r>
+            <w:r>
+              <w:rPr>
+                <w:noProof/>
+                <w:webHidden/>
+              </w:rPr>
+              <w:fldChar w:fldCharType="end"/>
+            </w:r>
+          </w:hyperlink>
+        </w:p>
+        <w:p>
+          <w:pPr>
+            <w:pStyle w:val="Sommario1"/>
+            <w:tabs>
+              <w:tab w:val="right" w:leader="dot" w:pos="9062"/>
+            </w:tabs>
+            <w:rPr>
+              <w:rFonts w:asciiTheme="minorHAnsi" w:eastAsiaTheme="minorEastAsia" w:hAnsiTheme="minorHAnsi"/>
+              <w:noProof/>
+              <w:color w:val="auto"/>
+              <w:sz w:val="24"/>
+              <w:lang w:val="it-IT" w:eastAsia="it-IT"/>
+            </w:rPr>
+          </w:pPr>
+          <w:hyperlink w:anchor="_Toc232860167" w:history="1">
+            <w:r>
+              <w:rPr>
+                <w:rStyle w:val="Collegamentoipertestuale"/>
+                <w:noProof/>
+              </w:rPr>
+              <w:t>5. Requisiti Funzionali</w:t>
+            </w:r>
+            <w:r>
+              <w:rPr>
+                <w:noProof/>
+                <w:webHidden/>
+              </w:rPr>
+              <w:tab/>
+            </w:r>
+            <w:r>
+              <w:rPr>
+                <w:noProof/>
+                <w:webHidden/>
+              </w:rPr>
+              <w:fldChar w:fldCharType="begin"/>
+            </w:r>
+            <w:r>
+              <w:rPr>
+                <w:noProof/>
+                <w:webHidden/>
+              </w:rPr>
+              <w:instrText xml:space="preserve"> PAGEREF _Toc232860167 \h </w:instrText>
+            </w:r>
+            <w:r>
+              <w:rPr>
+                <w:noProof/>
+                <w:webHidden/>
+              </w:rPr>
+            </w:r>
+            <w:r>
+              <w:rPr>
+                <w:noProof/>
+                <w:webHidden/>
+              </w:rPr>
+              <w:fldChar w:fldCharType="separate"/>
+            </w:r>
+            <w:r>
+              <w:rPr>
+                <w:noProof/>
+                <w:webHidden/>
+              </w:rPr>
+              <w:t>10</w:t>
+            </w:r>
+            <w:r>
+              <w:rPr>
+                <w:noProof/>
+                <w:webHidden/>
+              </w:rPr>
+              <w:fldChar w:fldCharType="end"/>
+            </w:r>
+          </w:hyperlink>
+        </w:p>
+        <w:p>
+          <w:pPr>
+            <w:pStyle w:val="Sommario1"/>
+            <w:tabs>
+              <w:tab w:val="right" w:leader="dot" w:pos="9062"/>
+            </w:tabs>
+            <w:rPr>
+              <w:rFonts w:asciiTheme="minorHAnsi" w:eastAsiaTheme="minorEastAsia" w:hAnsiTheme="minorHAnsi"/>
+              <w:noProof/>
+              <w:color w:val="auto"/>
+              <w:sz w:val="24"/>
+              <w:lang w:val="it-IT" w:eastAsia="it-IT"/>
+            </w:rPr>
+          </w:pPr>
+          <w:hyperlink w:anchor="_Toc232860168" w:history="1">
+            <w:r>
+              <w:rPr>
+                <w:rStyle w:val="Collegamentoipertestuale"/>
+                <w:noProof/>
+              </w:rPr>
+              <w:t>6. Requisiti Non Funzionali</w:t>
+            </w:r>
+            <w:r>
+              <w:rPr>
+                <w:noProof/>
+                <w:webHidden/>
+              </w:rPr>
+              <w:tab/>
+            </w:r>
+            <w:r>
+              <w:rPr>
+                <w:noProof/>
+                <w:webHidden/>
+              </w:rPr>
+              <w:fldChar w:fldCharType="begin"/>
+            </w:r>
+            <w:r>
+              <w:rPr>
+                <w:noProof/>
+                <w:webHidden/>
+              </w:rPr>
+              <w:instrText xml:space="preserve"> PAGEREF _Toc232860168 \h </w:instrText>
+            </w:r>
+            <w:r>
+              <w:rPr>
+                <w:noProof/>
+                <w:webHidden/>
+              </w:rPr>
+            </w:r>
+            <w:r>
+              <w:rPr>
+                <w:noProof/>
+                <w:webHidden/>
+              </w:rPr>
+              <w:fldChar w:fldCharType="separate"/>
+            </w:r>
+            <w:r>
+              <w:rPr>
+                <w:noProof/>
+                <w:webHidden/>
+              </w:rPr>
+              <w:t>11</w:t>
+            </w:r>
+            <w:r>
+              <w:rPr>
+                <w:noProof/>
+                <w:webHidden/>
+              </w:rPr>
+              <w:fldChar w:fldCharType="end"/>
+            </w:r>
+          </w:hyperlink>
+        </w:p>
+        <w:p>
+          <w:pPr>
+            <w:pStyle w:val="Sommario1"/>
+            <w:tabs>
+              <w:tab w:val="right" w:leader="dot" w:pos="9062"/>
+            </w:tabs>
+            <w:rPr>
+              <w:rFonts w:asciiTheme="minorHAnsi" w:eastAsiaTheme="minorEastAsia" w:hAnsiTheme="minorHAnsi"/>
+              <w:noProof/>
+              <w:color w:val="auto"/>
+              <w:sz w:val="24"/>
+              <w:lang w:val="it-IT" w:eastAsia="it-IT"/>
+            </w:rPr>
+          </w:pPr>
+          <w:hyperlink w:anchor="_Toc232860169" w:history="1">
+            <w:r>
+              <w:rPr>
+                <w:rStyle w:val="Collegamentoipertestuale"/>
+                <w:noProof/>
+              </w:rPr>
+              <w:t>7. Casi d'Uso Principali</w:t>
+            </w:r>
+            <w:r>
+              <w:rPr>
+                <w:noProof/>
+                <w:webHidden/>
+              </w:rPr>
+              <w:tab/>
+            </w:r>
+            <w:r>
+              <w:rPr>
+                <w:noProof/>
+                <w:webHidden/>
+              </w:rPr>
+              <w:fldChar w:fldCharType="begin"/>
+            </w:r>
+            <w:r>
+              <w:rPr>
+                <w:noProof/>
+                <w:webHidden/>
+              </w:rPr>
+              <w:instrText xml:space="preserve"> PAGEREF _Toc232860169 \h </w:instrText>
+            </w:r>
+            <w:r>
+              <w:rPr>
+                <w:noProof/>
+                <w:webHidden/>
+              </w:rPr>
+            </w:r>
+            <w:r>
+              <w:rPr>
+                <w:noProof/>
+                <w:webHidden/>
+              </w:rPr>
+              <w:fldChar w:fldCharType="separate"/>
+            </w:r>
+            <w:r>
+              <w:rPr>
+                <w:noProof/>
+                <w:webHidden/>
+              </w:rPr>
+              <w:t>12</w:t>
+            </w:r>
+            <w:r>
+              <w:rPr>
+                <w:noProof/>
+                <w:webHidden/>
+              </w:rPr>
+              <w:fldChar w:fldCharType="end"/>
+            </w:r>
+          </w:hyperlink>
+        </w:p>
+        <w:p>
+          <w:pPr>
+            <w:pStyle w:val="Sommario2"/>
+            <w:tabs>
+              <w:tab w:val="right" w:leader="dot" w:pos="9062"/>
+            </w:tabs>
+            <w:rPr>
+              <w:noProof/>
+            </w:rPr>
+          </w:pPr>
+          <w:hyperlink w:anchor="_Toc232860170" w:history="1">
+            <w:r>
+              <w:rPr>
+                <w:rStyle w:val="Collegamentoipertestuale"/>
+                <w:noProof/>
+              </w:rPr>
+              <w:t>UC-001  -  Login (Mock)</w:t>
+            </w:r>
+            <w:r>
+              <w:rPr>
+                <w:noProof/>
+                <w:webHidden/>
+              </w:rPr>
+              <w:tab/>
+            </w:r>
+            <w:r>
+              <w:rPr>
+                <w:noProof/>
+                <w:webHidden/>
+              </w:rPr>
+              <w:fldChar w:fldCharType="begin"/>
+            </w:r>
+            <w:r>
+              <w:rPr>
+                <w:noProof/>
+                <w:webHidden/>
+              </w:rPr>
+              <w:instrText xml:space="preserve"> PAGEREF _Toc232860170 \h </w:instrText>
+            </w:r>
+            <w:r>
+              <w:rPr>
+                <w:noProof/>
+                <w:webHidden/>
+              </w:rPr>
+            </w:r>
+            <w:r>
+              <w:rPr>
+                <w:noProof/>
+                <w:webHidden/>
+              </w:rPr>
+              <w:fldChar w:fldCharType="separate"/>
+            </w:r>
+            <w:r>
+              <w:rPr>
+                <w:noProof/>
+                <w:webHidden/>
+              </w:rPr>
+              <w:t>12</w:t>
+            </w:r>
+            <w:r>
+              <w:rPr>
+                <w:noProof/>
+                <w:webHidden/>
+              </w:rPr>
+              <w:fldChar w:fldCharType="end"/>
+            </w:r>
+          </w:hyperlink>
+        </w:p>
+        <w:p>
+          <w:pPr>
+            <w:pStyle w:val="Sommario2"/>
+            <w:tabs>
+              <w:tab w:val="right" w:leader="dot" w:pos="9062"/>
+            </w:tabs>
+            <w:rPr>
+              <w:noProof/>
+            </w:rPr>
+          </w:pPr>
+          <w:hyperlink w:anchor="_Toc232860171" w:history="1">
+            <w:r>
+              <w:rPr>
+                <w:rStyle w:val="Collegamentoipertestuale"/>
+                <w:noProof/>
+              </w:rPr>
+              <w:t>UC-002  -  Crea Progetto</w:t>
+            </w:r>
+            <w:r>
+              <w:rPr>
+                <w:noProof/>
+                <w:webHidden/>
+              </w:rPr>
+              <w:tab/>
+            </w:r>
+            <w:r>
+              <w:rPr>
+                <w:noProof/>
+                <w:webHidden/>
+              </w:rPr>
+              <w:fldChar w:fldCharType="begin"/>
+            </w:r>
+            <w:r>
+              <w:rPr>
+                <w:noProof/>
+                <w:webHidden/>
+              </w:rPr>
+              <w:instrText xml:space="preserve"> PAGEREF _Toc232860171 \h </w:instrText>
+            </w:r>
+            <w:r>
+              <w:rPr>
+                <w:noProof/>
+                <w:webHidden/>
+              </w:rPr>
+            </w:r>
+            <w:r>
+              <w:rPr>
+                <w:noProof/>
+                <w:webHidden/>
+              </w:rPr>
+              <w:fldChar w:fldCharType="separate"/>
+            </w:r>
+            <w:r>
+              <w:rPr>
+                <w:noProof/>
+                <w:webHidden/>
+              </w:rPr>
+              <w:t>12</w:t>
+            </w:r>
+            <w:r>
+              <w:rPr>
+                <w:noProof/>
+                <w:webHidden/>
+              </w:rPr>
+              <w:fldChar w:fldCharType="end"/>
+            </w:r>
+          </w:hyperlink>
+        </w:p>
+        <w:p>
+          <w:pPr>
+            <w:pStyle w:val="Sommario2"/>
+            <w:tabs>
+              <w:tab w:val="right" w:leader="dot" w:pos="9062"/>
+            </w:tabs>
+            <w:rPr>
+              <w:noProof/>
+            </w:rPr>
+          </w:pPr>
+          <w:hyperlink w:anchor="_Toc232860172" w:history="1">
+            <w:r>
+              <w:rPr>
+                <w:rStyle w:val="Collegamentoipertestuale"/>
+                <w:noProof/>
+              </w:rPr>
+              <w:t>UC-003  -  Attiva Progetto</w:t>
+            </w:r>
+            <w:r>
+              <w:rPr>
+                <w:noProof/>
+                <w:webHidden/>
+              </w:rPr>
+              <w:tab/>
+            </w:r>
+            <w:r>
+              <w:rPr>
+                <w:noProof/>
+                <w:webHidden/>
+              </w:rPr>
+              <w:fldChar w:fldCharType="begin"/>
+            </w:r>
+            <w:r>
+              <w:rPr>
+                <w:noProof/>
+                <w:webHidden/>
+              </w:rPr>
+              <w:instrText xml:space="preserve"> PAGEREF _Toc232860172 \h </w:instrText>
+            </w:r>
+            <w:r>
+              <w:rPr>
+                <w:noProof/>
+                <w:webHidden/>
+              </w:rPr>
+            </w:r>
+            <w:r>
+              <w:rPr>
+                <w:noProof/>
+                <w:webHidden/>
+              </w:rPr>
+              <w:fldChar w:fldCharType="separate"/>
+            </w:r>
+            <w:r>
+              <w:rPr>
+                <w:noProof/>
+                <w:webHidden/>
+              </w:rPr>
+              <w:t>12</w:t>
+            </w:r>
+            <w:r>
+              <w:rPr>
+                <w:noProof/>
+                <w:webHidden/>
+              </w:rPr>
+              <w:fldChar w:fldCharType="end"/>
+            </w:r>
+          </w:hyperlink>
+        </w:p>
+        <w:p>
+          <w:pPr>
+            <w:pStyle w:val="Sommario2"/>
+            <w:tabs>
+              <w:tab w:val="right" w:leader="dot" w:pos="9062"/>
+            </w:tabs>
+            <w:rPr>
+              <w:noProof/>
+            </w:rPr>
+          </w:pPr>
+          <w:hyperlink w:anchor="_Toc232860173" w:history="1">
+            <w:r>
+              <w:rPr>
+                <w:rStyle w:val="Collegamentoipertestuale"/>
+                <w:noProof/>
+              </w:rPr>
+              <w:t>UC-004  -  Registra Consuntivo</w:t>
+            </w:r>
+            <w:r>
+              <w:rPr>
+                <w:noProof/>
+                <w:webHidden/>
+              </w:rPr>
+              <w:tab/>
+            </w:r>
+            <w:r>
+              <w:rPr>
+                <w:noProof/>
+                <w:webHidden/>
+              </w:rPr>
+              <w:fldChar w:fldCharType="begin"/>
+            </w:r>
+            <w:r>
+              <w:rPr>
+                <w:noProof/>
+                <w:webHidden/>
+              </w:rPr>
+              <w:instrText xml:space="preserve"> PAGEREF _Toc232860173 \h </w:instrText>
+            </w:r>
+            <w:r>
+              <w:rPr>
+                <w:noProof/>
+                <w:webHidden/>
+              </w:rPr>
+            </w:r>
+            <w:r>
+              <w:rPr>
+                <w:noProof/>
+                <w:webHidden/>
+              </w:rPr>
+              <w:fldChar w:fldCharType="separate"/>
+            </w:r>
+            <w:r>
+              <w:rPr>
+                <w:noProof/>
+                <w:webHidden/>
+              </w:rPr>
+              <w:t>12</w:t>
+            </w:r>
+            <w:r>
+              <w:rPr>
+                <w:noProof/>
+                <w:webHidden/>
+              </w:rPr>
+              <w:fldChar w:fldCharType="end"/>
+            </w:r>
+          </w:hyperlink>
+        </w:p>
+        <w:p>
+          <w:pPr>
+            <w:pStyle w:val="Sommario2"/>
+            <w:tabs>
+              <w:tab w:val="right" w:leader="dot" w:pos="9062"/>
+            </w:tabs>
+            <w:rPr>
+              <w:noProof/>
+            </w:rPr>
+          </w:pPr>
+          <w:hyperlink w:anchor="_Toc232860174" w:history="1">
+            <w:r>
+              <w:rPr>
+                <w:rStyle w:val="Collegamentoipertestuale"/>
+                <w:noProof/>
+              </w:rPr>
+              <w:t>UC-005  -  Visualizza KPI Progetto</w:t>
+            </w:r>
+            <w:r>
+              <w:rPr>
+                <w:noProof/>
+                <w:webHidden/>
+              </w:rPr>
+              <w:tab/>
+            </w:r>
+            <w:r>
+              <w:rPr>
+                <w:noProof/>
+                <w:webHidden/>
+              </w:rPr>
+              <w:fldChar w:fldCharType="begin"/>
+            </w:r>
+            <w:r>
+              <w:rPr>
+                <w:noProof/>
+                <w:webHidden/>
+              </w:rPr>
+              <w:instrText xml:space="preserve"> PAGEREF _Toc232860174 \h </w:instrText>
+            </w:r>
+            <w:r>
+              <w:rPr>
+                <w:noProof/>
+                <w:webHidden/>
+              </w:rPr>
+            </w:r>
+            <w:r>
+              <w:rPr>
+                <w:noProof/>
+                <w:webHidden/>
+              </w:rPr>
+              <w:fldChar w:fldCharType="separate"/>
+            </w:r>
+            <w:r>
+              <w:rPr>
+                <w:noProof/>
+                <w:webHidden/>
+              </w:rPr>
+              <w:t>13</w:t>
+            </w:r>
+            <w:r>
+              <w:rPr>
+                <w:noProof/>
+                <w:webHidden/>
+              </w:rPr>
+              <w:fldChar w:fldCharType="end"/>
+            </w:r>
+          </w:hyperlink>
+        </w:p>
+        <w:p>
+          <w:pPr>
+            <w:pStyle w:val="Sommario2"/>
+            <w:tabs>
+              <w:tab w:val="right" w:leader="dot" w:pos="9062"/>
+            </w:tabs>
+            <w:rPr>
+              <w:noProof/>
+            </w:rPr>
+          </w:pPr>
+          <w:hyperlink w:anchor="_Toc232860175" w:history="1">
+            <w:r>
+              <w:rPr>
+                <w:rStyle w:val="Collegamentoipertestuale"/>
+                <w:noProof/>
+              </w:rPr>
+              <w:t>UC-006  -  Consulta Alert</w:t>
+            </w:r>
+            <w:r>
+              <w:rPr>
+                <w:noProof/>
+                <w:webHidden/>
+              </w:rPr>
+              <w:tab/>
+            </w:r>
+            <w:r>
+              <w:rPr>
+                <w:noProof/>
+                <w:webHidden/>
+              </w:rPr>
+              <w:fldChar w:fldCharType="begin"/>
+            </w:r>
+            <w:r>
+              <w:rPr>
+                <w:noProof/>
+                <w:webHidden/>
+              </w:rPr>
+              <w:instrText xml:space="preserve"> PAGEREF _Toc232860175 \h </w:instrText>
+            </w:r>
+            <w:r>
+              <w:rPr>
+                <w:noProof/>
+                <w:webHidden/>
+              </w:rPr>
+            </w:r>
+            <w:r>
+              <w:rPr>
+                <w:noProof/>
+                <w:webHidden/>
+              </w:rPr>
+              <w:fldChar w:fldCharType="separate"/>
+            </w:r>
+            <w:r>
+              <w:rPr>
+                <w:noProof/>
+                <w:webHidden/>
+              </w:rPr>
+              <w:t>13</w:t>
+            </w:r>
+            <w:r>
+              <w:rPr>
+                <w:noProof/>
+                <w:webHidden/>
+              </w:rPr>
+              <w:fldChar w:fldCharType="end"/>
+            </w:r>
+          </w:hyperlink>
+        </w:p>
+        <w:p>
+          <w:pPr>
+            <w:pStyle w:val="Sommario2"/>
+            <w:tabs>
+              <w:tab w:val="right" w:leader="dot" w:pos="9062"/>
+            </w:tabs>
+            <w:rPr>
+              <w:noProof/>
+            </w:rPr>
+          </w:pPr>
+          <w:hyperlink w:anchor="_Toc232860176" w:history="1">
+            <w:r>
+              <w:rPr>
+                <w:rStyle w:val="Collegamentoipertestuale"/>
+                <w:noProof/>
+              </w:rPr>
+              <w:t>UC-007  -  Dashboard Riepilogativa</w:t>
+            </w:r>
+            <w:r>
+              <w:rPr>
+                <w:noProof/>
+                <w:webHidden/>
+              </w:rPr>
+              <w:tab/>
+            </w:r>
+            <w:r>
+              <w:rPr>
+                <w:noProof/>
+                <w:webHidden/>
+              </w:rPr>
+              <w:fldChar w:fldCharType="begin"/>
+            </w:r>
+            <w:r>
+              <w:rPr>
+                <w:noProof/>
+                <w:webHidden/>
+              </w:rPr>
+              <w:instrText xml:space="preserve"> PAGEREF _Toc232860176 \h </w:instrText>
+            </w:r>
+            <w:r>
+              <w:rPr>
+                <w:noProof/>
+                <w:webHidden/>
+              </w:rPr>
+            </w:r>
+            <w:r>
+              <w:rPr>
+                <w:noProof/>
+                <w:webHidden/>
+              </w:rPr>
+              <w:fldChar w:fldCharType="separate"/>
+            </w:r>
+            <w:r>
+              <w:rPr>
+                <w:noProof/>
+                <w:webHidden/>
+              </w:rPr>
+              <w:t>13</w:t>
+            </w:r>
+            <w:r>
+              <w:rPr>
+                <w:noProof/>
+                <w:webHidden/>
+              </w:rPr>
+              <w:fldChar w:fldCharType="end"/>
+            </w:r>
+          </w:hyperlink>
+        </w:p>
+        <w:p>
+          <w:pPr>
+            <w:pStyle w:val="Sommario2"/>
+            <w:tabs>
+              <w:tab w:val="right" w:leader="dot" w:pos="9062"/>
+            </w:tabs>
+            <w:rPr>
+              <w:noProof/>
+            </w:rPr>
+          </w:pPr>
+          <w:hyperlink w:anchor="_Toc232860177" w:history="1">
+            <w:r>
+              <w:rPr>
+                <w:rStyle w:val="Collegamentoipertestuale"/>
+                <w:noProof/>
+              </w:rPr>
+              <w:t>UC-008  -  Cambio Stato Progetto</w:t>
+            </w:r>
+            <w:r>
+              <w:rPr>
+                <w:noProof/>
+                <w:webHidden/>
+              </w:rPr>
+              <w:tab/>
+            </w:r>
+            <w:r>
+              <w:rPr>
+                <w:noProof/>
+                <w:webHidden/>
+              </w:rPr>
+              <w:fldChar w:fldCharType="begin"/>
+            </w:r>
+            <w:r>
+              <w:rPr>
+                <w:noProof/>
+                <w:webHidden/>
+              </w:rPr>
+              <w:instrText xml:space="preserve"> PAGEREF _Toc232860177 \h </w:instrText>
+            </w:r>
+            <w:r>
+              <w:rPr>
+                <w:noProof/>
+                <w:webHidden/>
+              </w:rPr>
+            </w:r>
+            <w:r>
+              <w:rPr>
+                <w:noProof/>
+                <w:webHidden/>
+              </w:rPr>
+              <w:fldChar w:fldCharType="separate"/>
+            </w:r>
+            <w:r>
+              <w:rPr>
+                <w:noProof/>
+                <w:webHidden/>
+              </w:rPr>
+              <w:t>13</w:t>
+            </w:r>
+            <w:r>
+              <w:rPr>
+                <w:noProof/>
+                <w:webHidden/>
+              </w:rPr>
+              <w:fldChar w:fldCharType="end"/>
+            </w:r>
+          </w:hyperlink>
+        </w:p>
+        <w:p>
+          <w:pPr>
+            <w:pStyle w:val="Sommario1"/>
+            <w:tabs>
+              <w:tab w:val="right" w:leader="dot" w:pos="9062"/>
+            </w:tabs>
+            <w:rPr>
+              <w:rFonts w:asciiTheme="minorHAnsi" w:eastAsiaTheme="minorEastAsia" w:hAnsiTheme="minorHAnsi"/>
+              <w:noProof/>
+              <w:color w:val="auto"/>
+              <w:sz w:val="24"/>
+              <w:lang w:val="it-IT" w:eastAsia="it-IT"/>
+            </w:rPr>
+          </w:pPr>
+          <w:hyperlink w:anchor="_Toc232860178" w:history="1">
+            <w:r>
+              <w:rPr>
+                <w:rStyle w:val="Collegamentoipertestuale"/>
+                <w:noProof/>
+              </w:rPr>
+              <w:t>8. Modello dei Dati</w:t>
+            </w:r>
+            <w:r>
+              <w:rPr>
+                <w:noProof/>
+                <w:webHidden/>
+              </w:rPr>
+              <w:tab/>
+            </w:r>
+            <w:r>
+              <w:rPr>
+                <w:noProof/>
+                <w:webHidden/>
+              </w:rPr>
+              <w:fldChar w:fldCharType="begin"/>
+            </w:r>
+            <w:r>
+              <w:rPr>
+                <w:noProof/>
+                <w:webHidden/>
+              </w:rPr>
+              <w:instrText xml:space="preserve"> PAGEREF _Toc232860178 \h </w:instrText>
+            </w:r>
+            <w:r>
+              <w:rPr>
+                <w:noProof/>
+                <w:webHidden/>
+              </w:rPr>
+            </w:r>
+            <w:r>
+              <w:rPr>
+                <w:noProof/>
+                <w:webHidden/>
+              </w:rPr>
+              <w:fldChar w:fldCharType="separate"/>
+            </w:r>
+            <w:r>
+              <w:rPr>
+                <w:noProof/>
+                <w:webHidden/>
+              </w:rPr>
+              <w:t>15</w:t>
+            </w:r>
+            <w:r>
+              <w:rPr>
+                <w:noProof/>
+                <w:webHidden/>
+              </w:rPr>
+              <w:fldChar w:fldCharType="end"/>
+            </w:r>
+          </w:hyperlink>
+        </w:p>
+        <w:p>
+          <w:pPr>
+            <w:pStyle w:val="Sommario2"/>
+            <w:tabs>
+              <w:tab w:val="right" w:leader="dot" w:pos="9062"/>
+            </w:tabs>
+            <w:rPr>
+              <w:noProof/>
+            </w:rPr>
+          </w:pPr>
+          <w:hyperlink w:anchor="_Toc232860179" w:history="1">
+            <w:r>
+              <w:rPr>
+                <w:rStyle w:val="Collegamentoipertestuale"/>
+                <w:noProof/>
+              </w:rPr>
+              <w:t>Project (Aggregate Root)</w:t>
+            </w:r>
+            <w:r>
+              <w:rPr>
+                <w:noProof/>
+                <w:webHidden/>
+              </w:rPr>
+              <w:tab/>
+            </w:r>
+            <w:r>
+              <w:rPr>
+                <w:noProof/>
+                <w:webHidden/>
+              </w:rPr>
+              <w:fldChar w:fldCharType="begin"/>
+            </w:r>
+            <w:r>
+              <w:rPr>
+                <w:noProof/>
+                <w:webHidden/>
+              </w:rPr>
+              <w:instrText xml:space="preserve"> PAGEREF _Toc232860179 \h </w:instrText>
+            </w:r>
+            <w:r>
+              <w:rPr>
+                <w:noProof/>
+                <w:webHidden/>
+              </w:rPr>
+            </w:r>
+            <w:r>
+              <w:rPr>
+                <w:noProof/>
+                <w:webHidden/>
+              </w:rPr>
+              <w:fldChar w:fldCharType="separate"/>
+            </w:r>
+            <w:r>
+              <w:rPr>
+                <w:noProof/>
+                <w:webHidden/>
+              </w:rPr>
+              <w:t>15</w:t>
+            </w:r>
+            <w:r>
+              <w:rPr>
+                <w:noProof/>
+                <w:webHidden/>
+              </w:rPr>
+              <w:fldChar w:fldCharType="end"/>
+            </w:r>
+          </w:hyperlink>
+        </w:p>
+        <w:p>
+          <w:pPr>
+            <w:pStyle w:val="Sommario2"/>
+            <w:tabs>
+              <w:tab w:val="right" w:leader="dot" w:pos="9062"/>
+            </w:tabs>
+            <w:rPr>
+              <w:noProof/>
+            </w:rPr>
+          </w:pPr>
+          <w:hyperlink w:anchor="_Toc232860180" w:history="1">
+            <w:r>
+              <w:rPr>
+                <w:rStyle w:val="Collegamentoipertestuale"/>
+                <w:noProof/>
+              </w:rPr>
+              <w:t>Allocation (child di Project)</w:t>
+            </w:r>
+            <w:r>
+              <w:rPr>
+                <w:noProof/>
+                <w:webHidden/>
+              </w:rPr>
+              <w:tab/>
+            </w:r>
+            <w:r>
+              <w:rPr>
+                <w:noProof/>
+                <w:webHidden/>
+              </w:rPr>
+              <w:fldChar w:fldCharType="begin"/>
+            </w:r>
+            <w:r>
+              <w:rPr>
+                <w:noProof/>
+                <w:webHidden/>
+              </w:rPr>
+              <w:instrText xml:space="preserve"> PAGEREF _Toc232860180 \h </w:instrText>
+            </w:r>
+            <w:r>
+              <w:rPr>
+                <w:noProof/>
+                <w:webHidden/>
+              </w:rPr>
+            </w:r>
+            <w:r>
+              <w:rPr>
+                <w:noProof/>
+                <w:webHidden/>
+              </w:rPr>
+              <w:fldChar w:fldCharType="separate"/>
+            </w:r>
+            <w:r>
+              <w:rPr>
+                <w:noProof/>
+                <w:webHidden/>
+              </w:rPr>
+              <w:t>15</w:t>
+            </w:r>
+            <w:r>
+              <w:rPr>
+                <w:noProof/>
+                <w:webHidden/>
+              </w:rPr>
+              <w:fldChar w:fldCharType="end"/>
+            </w:r>
+          </w:hyperlink>
+        </w:p>
+        <w:p>
+          <w:pPr>
+            <w:pStyle w:val="Sommario2"/>
+            <w:tabs>
+              <w:tab w:val="right" w:leader="dot" w:pos="9062"/>
+            </w:tabs>
+            <w:rPr>
+              <w:noProof/>
+            </w:rPr>
+          </w:pPr>
+          <w:hyperlink w:anchor="_Toc232860181" w:history="1">
+            <w:r>
+              <w:rPr>
+                <w:rStyle w:val="Collegamentoipertestuale"/>
+                <w:noProof/>
+              </w:rPr>
+              <w:t>Customer</w:t>
+            </w:r>
+            <w:r>
+              <w:rPr>
+                <w:noProof/>
+                <w:webHidden/>
+              </w:rPr>
+              <w:tab/>
+            </w:r>
+            <w:r>
+              <w:rPr>
+                <w:noProof/>
+                <w:webHidden/>
+              </w:rPr>
+              <w:fldChar w:fldCharType="begin"/>
+            </w:r>
+            <w:r>
+              <w:rPr>
+                <w:noProof/>
+                <w:webHidden/>
+              </w:rPr>
+              <w:instrText xml:space="preserve"> PAGEREF _Toc232860181 \h </w:instrText>
+            </w:r>
+            <w:r>
+              <w:rPr>
+                <w:noProof/>
+                <w:webHidden/>
+              </w:rPr>
+            </w:r>
+            <w:r>
+              <w:rPr>
+                <w:noProof/>
+                <w:webHidden/>
+              </w:rPr>
+              <w:fldChar w:fldCharType="separate"/>
+            </w:r>
+            <w:r>
+              <w:rPr>
+                <w:noProof/>
+                <w:webHidden/>
+              </w:rPr>
+              <w:t>15</w:t>
+            </w:r>
+            <w:r>
+              <w:rPr>
+                <w:noProof/>
+                <w:webHidden/>
+              </w:rPr>
+              <w:fldChar w:fldCharType="end"/>
+            </w:r>
+          </w:hyperlink>
+        </w:p>
+        <w:p>
+          <w:pPr>
+            <w:pStyle w:val="Sommario2"/>
+            <w:tabs>
+              <w:tab w:val="right" w:leader="dot" w:pos="9062"/>
+            </w:tabs>
+            <w:rPr>
+              <w:noProof/>
+            </w:rPr>
+          </w:pPr>
+          <w:hyperlink w:anchor="_Toc232860182" w:history="1">
+            <w:r>
+              <w:rPr>
+                <w:rStyle w:val="Collegamentoipertestuale"/>
+                <w:noProof/>
+              </w:rPr>
+              <w:t>Employee</w:t>
+            </w:r>
+            <w:r>
+              <w:rPr>
+                <w:noProof/>
+                <w:webHidden/>
+              </w:rPr>
+              <w:tab/>
+            </w:r>
+            <w:r>
+              <w:rPr>
+                <w:noProof/>
+                <w:webHidden/>
+              </w:rPr>
+              <w:fldChar w:fldCharType="begin"/>
+            </w:r>
+            <w:r>
+              <w:rPr>
+                <w:noProof/>
+                <w:webHidden/>
+              </w:rPr>
+              <w:instrText xml:space="preserve"> PAGEREF _Toc232860182 \h </w:instrText>
+            </w:r>
+            <w:r>
+              <w:rPr>
+                <w:noProof/>
+                <w:webHidden/>
+              </w:rPr>
+            </w:r>
+            <w:r>
+              <w:rPr>
+                <w:noProof/>
+                <w:webHidden/>
+              </w:rPr>
+              <w:fldChar w:fldCharType="separate"/>
+            </w:r>
+            <w:r>
+              <w:rPr>
+                <w:noProof/>
+                <w:webHidden/>
+              </w:rPr>
+              <w:t>16</w:t>
+            </w:r>
+            <w:r>
+              <w:rPr>
+                <w:noProof/>
+                <w:webHidden/>
+              </w:rPr>
+              <w:fldChar w:fldCharType="end"/>
+            </w:r>
+          </w:hyperlink>
+        </w:p>
+        <w:p>
+          <w:pPr>
+            <w:pStyle w:val="Sommario2"/>
+            <w:tabs>
+              <w:tab w:val="right" w:leader="dot" w:pos="9062"/>
+            </w:tabs>
+            <w:rPr>
+              <w:noProof/>
+            </w:rPr>
+          </w:pPr>
+          <w:hyperlink w:anchor="_Toc232860183" w:history="1">
+            <w:r>
+              <w:rPr>
+                <w:rStyle w:val="Collegamentoipertestuale"/>
+                <w:noProof/>
+              </w:rPr>
+              <w:t>Figure</w:t>
+            </w:r>
+            <w:r>
+              <w:rPr>
+                <w:noProof/>
+                <w:webHidden/>
+              </w:rPr>
+              <w:tab/>
+            </w:r>
+            <w:r>
+              <w:rPr>
+                <w:noProof/>
+                <w:webHidden/>
+              </w:rPr>
+              <w:fldChar w:fldCharType="begin"/>
+            </w:r>
+            <w:r>
+              <w:rPr>
+                <w:noProof/>
+                <w:webHidden/>
+              </w:rPr>
+              <w:instrText xml:space="preserve"> PAGEREF _Toc232860183 \h </w:instrText>
+            </w:r>
+            <w:r>
+              <w:rPr>
+                <w:noProof/>
+                <w:webHidden/>
+              </w:rPr>
+            </w:r>
+            <w:r>
+              <w:rPr>
+                <w:noProof/>
+                <w:webHidden/>
+              </w:rPr>
+              <w:fldChar w:fldCharType="separate"/>
+            </w:r>
+            <w:r>
+              <w:rPr>
+                <w:noProof/>
+                <w:webHidden/>
+              </w:rPr>
+              <w:t>16</w:t>
+            </w:r>
+            <w:r>
+              <w:rPr>
+                <w:noProof/>
+                <w:webHidden/>
+              </w:rPr>
+              <w:fldChar w:fldCharType="end"/>
+            </w:r>
+          </w:hyperlink>
+        </w:p>
+        <w:p>
+          <w:pPr>
+            <w:pStyle w:val="Sommario2"/>
+            <w:tabs>
+              <w:tab w:val="right" w:leader="dot" w:pos="9062"/>
+            </w:tabs>
+            <w:rPr>
+              <w:noProof/>
+            </w:rPr>
+          </w:pPr>
+          <w:hyperlink w:anchor="_Toc232860184" w:history="1">
+            <w:r>
+              <w:rPr>
+                <w:rStyle w:val="Collegamentoipertestuale"/>
+                <w:noProof/>
+              </w:rPr>
+              <w:t>User</w:t>
+            </w:r>
+            <w:r>
+              <w:rPr>
+                <w:noProof/>
+                <w:webHidden/>
+              </w:rPr>
+              <w:tab/>
+            </w:r>
+            <w:r>
+              <w:rPr>
+                <w:noProof/>
+                <w:webHidden/>
+              </w:rPr>
+              <w:fldChar w:fldCharType="begin"/>
+            </w:r>
+            <w:r>
+              <w:rPr>
+                <w:noProof/>
+                <w:webHidden/>
+              </w:rPr>
+              <w:instrText xml:space="preserve"> PAGEREF _Toc232860184 \h </w:instrText>
+            </w:r>
+            <w:r>
+              <w:rPr>
+                <w:noProof/>
+                <w:webHidden/>
+              </w:rPr>
+            </w:r>
+            <w:r>
+              <w:rPr>
+                <w:noProof/>
+                <w:webHidden/>
+              </w:rPr>
+              <w:fldChar w:fldCharType="separate"/>
+            </w:r>
+            <w:r>
+              <w:rPr>
+                <w:noProof/>
+                <w:webHidden/>
+              </w:rPr>
+              <w:t>16</w:t>
+            </w:r>
+            <w:r>
+              <w:rPr>
+                <w:noProof/>
+                <w:webHidden/>
+              </w:rPr>
+              <w:fldChar w:fldCharType="end"/>
+            </w:r>
+          </w:hyperlink>
+        </w:p>
+        <w:p>
+          <w:pPr>
+            <w:pStyle w:val="Sommario1"/>
+            <w:tabs>
+              <w:tab w:val="right" w:leader="dot" w:pos="9062"/>
+            </w:tabs>
+            <w:rPr>
+              <w:rFonts w:asciiTheme="minorHAnsi" w:eastAsiaTheme="minorEastAsia" w:hAnsiTheme="minorHAnsi"/>
+              <w:noProof/>
+              <w:color w:val="auto"/>
+              <w:sz w:val="24"/>
+              <w:lang w:val="it-IT" w:eastAsia="it-IT"/>
+            </w:rPr>
+          </w:pPr>
+          <w:hyperlink w:anchor="_Toc232860185" w:history="1">
+            <w:r>
+              <w:rPr>
+                <w:rStyle w:val="Collegamentoipertestuale"/>
+                <w:noProof/>
+              </w:rPr>
+              <w:t>9. Regole di Business</w:t>
+            </w:r>
+            <w:r>
+              <w:rPr>
+                <w:noProof/>
+                <w:webHidden/>
+              </w:rPr>
+              <w:tab/>
+            </w:r>
+            <w:r>
+              <w:rPr>
+                <w:noProof/>
+                <w:webHidden/>
+              </w:rPr>
+              <w:fldChar w:fldCharType="begin"/>
+            </w:r>
+            <w:r>
+              <w:rPr>
+                <w:noProof/>
+                <w:webHidden/>
+              </w:rPr>
+              <w:instrText xml:space="preserve"> PAGEREF _Toc232860185 \h </w:instrText>
+            </w:r>
+            <w:r>
+              <w:rPr>
+                <w:noProof/>
+                <w:webHidden/>
+              </w:rPr>
+            </w:r>
+            <w:r>
+              <w:rPr>
+                <w:noProof/>
+                <w:webHidden/>
+              </w:rPr>
+              <w:fldChar w:fldCharType="separate"/>
+            </w:r>
+            <w:r>
+              <w:rPr>
+                <w:noProof/>
+                <w:webHidden/>
+              </w:rPr>
+              <w:t>17</w:t>
+            </w:r>
+            <w:r>
+              <w:rPr>
+                <w:noProof/>
+                <w:webHidden/>
+              </w:rPr>
+              <w:fldChar w:fldCharType="end"/>
+            </w:r>
+          </w:hyperlink>
+        </w:p>
+        <w:p>
+          <w:pPr>
+            <w:pStyle w:val="Sommario2"/>
+            <w:tabs>
+              <w:tab w:val="right" w:leader="dot" w:pos="9062"/>
+            </w:tabs>
+            <w:rPr>
+              <w:noProof/>
+            </w:rPr>
+          </w:pPr>
+          <w:hyperlink w:anchor="_Toc232860186" w:history="1">
+            <w:r>
+              <w:rPr>
+                <w:rStyle w:val="Collegamentoipertestuale"/>
+                <w:noProof/>
+              </w:rPr>
+              <w:t>9.1  Invarianti di dominio</w:t>
+            </w:r>
+            <w:r>
+              <w:rPr>
+                <w:noProof/>
+                <w:webHidden/>
+              </w:rPr>
+              <w:tab/>
+            </w:r>
+            <w:r>
+              <w:rPr>
+                <w:noProof/>
+                <w:webHidden/>
+              </w:rPr>
+              <w:fldChar w:fldCharType="begin"/>
+            </w:r>
+            <w:r>
+              <w:rPr>
+                <w:noProof/>
+                <w:webHidden/>
+              </w:rPr>
+              <w:instrText xml:space="preserve"> PAGEREF _Toc232860186 \h </w:instrText>
+            </w:r>
+            <w:r>
+              <w:rPr>
+                <w:noProof/>
+                <w:webHidden/>
+              </w:rPr>
+            </w:r>
+            <w:r>
+              <w:rPr>
+                <w:noProof/>
+                <w:webHidden/>
+              </w:rPr>
+              <w:fldChar w:fldCharType="separate"/>
+            </w:r>
+            <w:r>
+              <w:rPr>
+                <w:noProof/>
+                <w:webHidden/>
+              </w:rPr>
+              <w:t>17</w:t>
+            </w:r>
+            <w:r>
+              <w:rPr>
+                <w:noProof/>
+                <w:webHidden/>
+              </w:rPr>
+              <w:fldChar w:fldCharType="end"/>
+            </w:r>
+          </w:hyperlink>
+        </w:p>
+        <w:p>
+          <w:pPr>
+            <w:pStyle w:val="Sommario2"/>
+            <w:tabs>
+              <w:tab w:val="right" w:leader="dot" w:pos="9062"/>
+            </w:tabs>
+            <w:rPr>
+              <w:noProof/>
+            </w:rPr>
+          </w:pPr>
+          <w:hyperlink w:anchor="_Toc232860187" w:history="1">
+            <w:r>
+              <w:rPr>
+                <w:rStyle w:val="Collegamentoipertestuale"/>
+                <w:noProof/>
+              </w:rPr>
+              <w:t>9.2  Formule KPI</w:t>
+            </w:r>
+            <w:r>
+              <w:rPr>
+                <w:noProof/>
+                <w:webHidden/>
+              </w:rPr>
+              <w:tab/>
+            </w:r>
+            <w:r>
+              <w:rPr>
+                <w:noProof/>
+                <w:webHidden/>
+              </w:rPr>
+              <w:fldChar w:fldCharType="begin"/>
+            </w:r>
+            <w:r>
+              <w:rPr>
+                <w:noProof/>
+                <w:webHidden/>
+              </w:rPr>
+              <w:instrText xml:space="preserve"> PAGEREF _Toc232860187 \h </w:instrText>
+            </w:r>
+            <w:r>
+              <w:rPr>
+                <w:noProof/>
+                <w:webHidden/>
+              </w:rPr>
+            </w:r>
+            <w:r>
+              <w:rPr>
+                <w:noProof/>
+                <w:webHidden/>
+              </w:rPr>
+              <w:fldChar w:fldCharType="separate"/>
+            </w:r>
+            <w:r>
+              <w:rPr>
+                <w:noProof/>
+                <w:webHidden/>
+              </w:rPr>
+              <w:t>17</w:t>
+            </w:r>
+            <w:r>
+              <w:rPr>
+                <w:noProof/>
+                <w:webHidden/>
+              </w:rPr>
+              <w:fldChar w:fldCharType="end"/>
+            </w:r>
+          </w:hyperlink>
+        </w:p>
+        <w:p>
+          <w:pPr>
+            <w:pStyle w:val="Sommario2"/>
+            <w:tabs>
+              <w:tab w:val="right" w:leader="dot" w:pos="9062"/>
+            </w:tabs>
+            <w:rPr>
+              <w:noProof/>
+            </w:rPr>
+          </w:pPr>
+          <w:hyperlink w:anchor="_Toc232860188" w:history="1">
+            <w:r>
+              <w:rPr>
+                <w:rStyle w:val="Collegamentoipertestuale"/>
+                <w:noProof/>
+              </w:rPr>
+              <w:t>9.3  Regole di alerting</w:t>
+            </w:r>
+            <w:r>
+              <w:rPr>
+                <w:noProof/>
+                <w:webHidden/>
+              </w:rPr>
+              <w:tab/>
+            </w:r>
+            <w:r>
+              <w:rPr>
+                <w:noProof/>
+                <w:webHidden/>
+              </w:rPr>
+              <w:fldChar w:fldCharType="begin"/>
+            </w:r>
+            <w:r>
+              <w:rPr>
+                <w:noProof/>
+                <w:webHidden/>
+              </w:rPr>
+              <w:instrText xml:space="preserve"> PAGEREF _Toc232860188 \h </w:instrText>
+            </w:r>
+            <w:r>
+              <w:rPr>
+                <w:noProof/>
+                <w:webHidden/>
+              </w:rPr>
+            </w:r>
+            <w:r>
+              <w:rPr>
+                <w:noProof/>
+                <w:webHidden/>
+              </w:rPr>
+              <w:fldChar w:fldCharType="separate"/>
+            </w:r>
+            <w:r>
+              <w:rPr>
+                <w:noProof/>
+                <w:webHidden/>
+              </w:rPr>
+              <w:t>17</w:t>
+            </w:r>
+            <w:r>
+              <w:rPr>
+                <w:noProof/>
+                <w:webHidden/>
+              </w:rPr>
+              <w:fldChar w:fldCharType="end"/>
+            </w:r>
+          </w:hyperlink>
+        </w:p>
+        <w:p>
+          <w:pPr>
+            <w:pStyle w:val="Sommario1"/>
+            <w:tabs>
+              <w:tab w:val="right" w:leader="dot" w:pos="9062"/>
+            </w:tabs>
+            <w:rPr>
+              <w:rFonts w:asciiTheme="minorHAnsi" w:eastAsiaTheme="minorEastAsia" w:hAnsiTheme="minorHAnsi"/>
+              <w:noProof/>
+              <w:color w:val="auto"/>
+              <w:sz w:val="24"/>
+              <w:lang w:val="it-IT" w:eastAsia="it-IT"/>
+            </w:rPr>
+          </w:pPr>
+          <w:hyperlink w:anchor="_Toc232860189" w:history="1">
+            <w:r>
+              <w:rPr>
+                <w:rStyle w:val="Collegamentoipertestuale"/>
+                <w:noProof/>
+              </w:rPr>
+              <w:t>10. Architettura e Infrastruttura</w:t>
+            </w:r>
+            <w:r>
+              <w:rPr>
+                <w:noProof/>
+                <w:webHidden/>
+              </w:rPr>
+              <w:tab/>
+            </w:r>
+            <w:r>
+              <w:rPr>
+                <w:noProof/>
+                <w:webHidden/>
+              </w:rPr>
+              <w:fldChar w:fldCharType="begin"/>
+            </w:r>
+            <w:r>
+              <w:rPr>
+                <w:noProof/>
+                <w:webHidden/>
+              </w:rPr>
+              <w:instrText xml:space="preserve"> PAGEREF _Toc232860189 \h </w:instrText>
+            </w:r>
+            <w:r>
+              <w:rPr>
+                <w:noProof/>
+                <w:webHidden/>
+              </w:rPr>
+            </w:r>
+            <w:r>
+              <w:rPr>
+                <w:noProof/>
+                <w:webHidden/>
+              </w:rPr>
+              <w:fldChar w:fldCharType="separate"/>
+            </w:r>
+            <w:r>
+              <w:rPr>
+                <w:noProof/>
+                <w:webHidden/>
+              </w:rPr>
+              <w:t>19</w:t>
+            </w:r>
+            <w:r>
+              <w:rPr>
+                <w:noProof/>
+                <w:webHidden/>
+              </w:rPr>
+              <w:fldChar w:fldCharType="end"/>
+            </w:r>
+          </w:hyperlink>
+        </w:p>
+        <w:p>
+          <w:pPr>
+            <w:pStyle w:val="Sommario2"/>
+            <w:tabs>
+              <w:tab w:val="right" w:leader="dot" w:pos="9062"/>
+            </w:tabs>
+            <w:rPr>
+              <w:noProof/>
+            </w:rPr>
+          </w:pPr>
+          <w:hyperlink w:anchor="_Toc232860190" w:history="1">
+            <w:r>
+              <w:rPr>
+                <w:rStyle w:val="Collegamentoipertestuale"/>
+                <w:noProof/>
+              </w:rPr>
+              <w:t>10.1  Stack tecnologico</w:t>
+            </w:r>
+            <w:r>
+              <w:rPr>
+                <w:noProof/>
+                <w:webHidden/>
+              </w:rPr>
+              <w:tab/>
+            </w:r>
+            <w:r>
+              <w:rPr>
+                <w:noProof/>
+                <w:webHidden/>
+              </w:rPr>
+              <w:fldChar w:fldCharType="begin"/>
+            </w:r>
+            <w:r>
+              <w:rPr>
+                <w:noProof/>
+                <w:webHidden/>
+              </w:rPr>
+              <w:instrText xml:space="preserve"> PAGEREF _Toc232860190 \h </w:instrText>
+            </w:r>
+            <w:r>
+              <w:rPr>
+                <w:noProof/>
+                <w:webHidden/>
+              </w:rPr>
+            </w:r>
+            <w:r>
+              <w:rPr>
+                <w:noProof/>
+                <w:webHidden/>
+              </w:rPr>
+              <w:fldChar w:fldCharType="separate"/>
+            </w:r>
+            <w:r>
+              <w:rPr>
+                <w:noProof/>
+                <w:webHidden/>
+              </w:rPr>
+              <w:t>19</w:t>
+            </w:r>
+            <w:r>
+              <w:rPr>
+                <w:noProof/>
+                <w:webHidden/>
+              </w:rPr>
+              <w:fldChar w:fldCharType="end"/>
+            </w:r>
+          </w:hyperlink>
+        </w:p>
+        <w:p>
+          <w:pPr>
+            <w:pStyle w:val="Sommario2"/>
+            <w:tabs>
+              <w:tab w:val="right" w:leader="dot" w:pos="9062"/>
+            </w:tabs>
+            <w:rPr>
+              <w:noProof/>
+            </w:rPr>
+          </w:pPr>
+          <w:hyperlink w:anchor="_Toc232860191" w:history="1">
+            <w:r>
+              <w:rPr>
+                <w:rStyle w:val="Collegamentoipertestuale"/>
+                <w:noProof/>
+              </w:rPr>
+              <w:t>10.2  Componenti Azure (Terraform)</w:t>
+            </w:r>
+            <w:r>
+              <w:rPr>
+                <w:noProof/>
+                <w:webHidden/>
+              </w:rPr>
+              <w:tab/>
+            </w:r>
+            <w:r>
+              <w:rPr>
+                <w:noProof/>
+                <w:webHidden/>
+              </w:rPr>
+              <w:fldChar w:fldCharType="begin"/>
+            </w:r>
+            <w:r>
+              <w:rPr>
+                <w:noProof/>
+                <w:webHidden/>
+              </w:rPr>
+              <w:instrText xml:space="preserve"> PAGEREF _Toc232860191 \h </w:instrText>
+            </w:r>
+            <w:r>
+              <w:rPr>
+                <w:noProof/>
+                <w:webHidden/>
+              </w:rPr>
+            </w:r>
+            <w:r>
+              <w:rPr>
+                <w:noProof/>
+                <w:webHidden/>
+              </w:rPr>
+              <w:fldChar w:fldCharType="separate"/>
+            </w:r>
+            <w:r>
+              <w:rPr>
+                <w:noProof/>
+                <w:webHidden/>
+              </w:rPr>
+              <w:t>19</w:t>
+            </w:r>
+            <w:r>
+              <w:rPr>
+                <w:noProof/>
+                <w:webHidden/>
+              </w:rPr>
+              <w:fldChar w:fldCharType="end"/>
+            </w:r>
+          </w:hyperlink>
+        </w:p>
+        <w:p>
+          <w:pPr>
+            <w:pStyle w:val="Sommario1"/>
+            <w:tabs>
+              <w:tab w:val="right" w:leader="dot" w:pos="9062"/>
+            </w:tabs>
+            <w:rPr>
+              <w:rFonts w:asciiTheme="minorHAnsi" w:eastAsiaTheme="minorEastAsia" w:hAnsiTheme="minorHAnsi"/>
+              <w:noProof/>
+              <w:color w:val="auto"/>
+              <w:sz w:val="24"/>
+              <w:lang w:val="it-IT" w:eastAsia="it-IT"/>
+            </w:rPr>
+          </w:pPr>
+          <w:hyperlink w:anchor="_Toc232860192" w:history="1">
+            <w:r>
+              <w:rPr>
+                <w:rStyle w:val="Collegamentoipertestuale"/>
+                <w:noProof/>
+              </w:rPr>
+              <w:t>11. Vincoli e Assunzioni</w:t>
+            </w:r>
+            <w:r>
+              <w:rPr>
+                <w:noProof/>
+                <w:webHidden/>
+              </w:rPr>
+              <w:tab/>
+            </w:r>
+            <w:r>
+              <w:rPr>
+                <w:noProof/>
+                <w:webHidden/>
+              </w:rPr>
+              <w:fldChar w:fldCharType="begin"/>
+            </w:r>
+            <w:r>
+              <w:rPr>
+                <w:noProof/>
+                <w:webHidden/>
+              </w:rPr>
+              <w:instrText xml:space="preserve"> PAGEREF _Toc232860192 \h </w:instrText>
+            </w:r>
+            <w:r>
+              <w:rPr>
+                <w:noProof/>
+                <w:webHidden/>
+              </w:rPr>
+            </w:r>
+            <w:r>
+              <w:rPr>
+                <w:noProof/>
+                <w:webHidden/>
+              </w:rPr>
+              <w:fldChar w:fldCharType="separate"/>
+            </w:r>
+            <w:r>
+              <w:rPr>
+                <w:noProof/>
+                <w:webHidden/>
+              </w:rPr>
+              <w:t>20</w:t>
+            </w:r>
+            <w:r>
+              <w:rPr>
+                <w:noProof/>
+                <w:webHidden/>
+              </w:rPr>
+              <w:fldChar w:fldCharType="end"/>
+            </w:r>
+          </w:hyperlink>
+        </w:p>
+        <w:p>
+          <w:pPr>
+            <w:pStyle w:val="Sommario2"/>
+            <w:tabs>
+              <w:tab w:val="right" w:leader="dot" w:pos="9062"/>
+            </w:tabs>
+            <w:rPr>
+              <w:noProof/>
+            </w:rPr>
+          </w:pPr>
+          <w:hyperlink w:anchor="_Toc232860193" w:history="1">
+            <w:r>
+              <w:rPr>
+                <w:rStyle w:val="Collegamentoipertestuale"/>
+                <w:noProof/>
+              </w:rPr>
+              <w:t>11.1  Vincoli tecnici</w:t>
+            </w:r>
+            <w:r>
+              <w:rPr>
+                <w:noProof/>
+                <w:webHidden/>
+              </w:rPr>
+              <w:tab/>
+            </w:r>
+            <w:r>
+              <w:rPr>
+                <w:noProof/>
+                <w:webHidden/>
+              </w:rPr>
+              <w:fldChar w:fldCharType="begin"/>
+            </w:r>
+            <w:r>
+              <w:rPr>
+                <w:noProof/>
+                <w:webHidden/>
+              </w:rPr>
+              <w:instrText xml:space="preserve"> PAGEREF _Toc232860193 \h </w:instrText>
+            </w:r>
+            <w:r>
+              <w:rPr>
+                <w:noProof/>
+                <w:webHidden/>
+              </w:rPr>
+            </w:r>
+            <w:r>
+              <w:rPr>
+                <w:noProof/>
+                <w:webHidden/>
+              </w:rPr>
+              <w:fldChar w:fldCharType="separate"/>
+            </w:r>
+            <w:r>
+              <w:rPr>
+                <w:noProof/>
+                <w:webHidden/>
+              </w:rPr>
+              <w:t>20</w:t>
+            </w:r>
+            <w:r>
+              <w:rPr>
+                <w:noProof/>
+                <w:webHidden/>
+              </w:rPr>
+              <w:fldChar w:fldCharType="end"/>
+            </w:r>
+          </w:hyperlink>
+        </w:p>
+        <w:p>
+          <w:pPr>
+            <w:pStyle w:val="Sommario2"/>
+            <w:tabs>
+              <w:tab w:val="right" w:leader="dot" w:pos="9062"/>
+            </w:tabs>
+            <w:rPr>
+              <w:noProof/>
+            </w:rPr>
+          </w:pPr>
+          <w:hyperlink w:anchor="_Toc232860194" w:history="1">
+            <w:r>
+              <w:rPr>
+                <w:rStyle w:val="Collegamentoipertestuale"/>
+                <w:noProof/>
+              </w:rPr>
+              <w:t>11.2  Assunzioni operative</w:t>
+            </w:r>
+            <w:r>
+              <w:rPr>
+                <w:noProof/>
+                <w:webHidden/>
+              </w:rPr>
+              <w:tab/>
+            </w:r>
+            <w:r>
+              <w:rPr>
+                <w:noProof/>
+                <w:webHidden/>
+              </w:rPr>
+              <w:fldChar w:fldCharType="begin"/>
+            </w:r>
+            <w:r>
+              <w:rPr>
+                <w:noProof/>
+                <w:webHidden/>
+              </w:rPr>
+              <w:instrText xml:space="preserve"> PAGEREF _Toc232860194 \h </w:instrText>
+            </w:r>
+            <w:r>
+              <w:rPr>
+                <w:noProof/>
+                <w:webHidden/>
+              </w:rPr>
+            </w:r>
+            <w:r>
+              <w:rPr>
+                <w:noProof/>
+                <w:webHidden/>
+              </w:rPr>
+              <w:fldChar w:fldCharType="separate"/>
+            </w:r>
+            <w:r>
+              <w:rPr>
+                <w:noProof/>
+                <w:webHidden/>
+              </w:rPr>
+              <w:t>20</w:t>
+            </w:r>
+            <w:r>
+              <w:rPr>
+                <w:noProof/>
+                <w:webHidden/>
+              </w:rPr>
+              <w:fldChar w:fldCharType="end"/>
+            </w:r>
+          </w:hyperlink>
+        </w:p>
+        <w:p>
+          <w:pPr>
+            <w:pStyle w:val="Sommario1"/>
+            <w:tabs>
+              <w:tab w:val="right" w:leader="dot" w:pos="9062"/>
+            </w:tabs>
+            <w:rPr>
+              <w:rFonts w:asciiTheme="minorHAnsi" w:eastAsiaTheme="minorEastAsia" w:hAnsiTheme="minorHAnsi"/>
+              <w:noProof/>
+              <w:color w:val="auto"/>
+              <w:sz w:val="24"/>
+              <w:lang w:val="it-IT" w:eastAsia="it-IT"/>
+            </w:rPr>
+          </w:pPr>
+          <w:hyperlink w:anchor="_Toc232860195" w:history="1">
+            <w:r>
+              <w:rPr>
+                <w:rStyle w:val="Collegamentoipertestuale"/>
+                <w:noProof/>
+              </w:rPr>
+              <w:t>12. Rischi e Mitigazioni</w:t>
+            </w:r>
+            <w:r>
+              <w:rPr>
+                <w:noProof/>
+                <w:webHidden/>
+              </w:rPr>
+              <w:tab/>
+            </w:r>
+            <w:r>
+              <w:rPr>
+                <w:noProof/>
+                <w:webHidden/>
+              </w:rPr>
+              <w:fldChar w:fldCharType="begin"/>
+            </w:r>
+            <w:r>
+              <w:rPr>
+                <w:noProof/>
+                <w:webHidden/>
+              </w:rPr>
+              <w:instrText xml:space="preserve"> PAGEREF _Toc232860195 \h </w:instrText>
+            </w:r>
+            <w:r>
+              <w:rPr>
+                <w:noProof/>
+                <w:webHidden/>
+              </w:rPr>
+            </w:r>
+            <w:r>
+              <w:rPr>
+                <w:noProof/>
+                <w:webHidden/>
+              </w:rPr>
+              <w:fldChar w:fldCharType="separate"/>
+            </w:r>
+            <w:r>
+              <w:rPr>
+                <w:noProof/>
+                <w:webHidden/>
+              </w:rPr>
+              <w:t>21</w:t>
+            </w:r>
+            <w:r>
+              <w:rPr>
+                <w:noProof/>
+                <w:webHidden/>
+              </w:rPr>
+              <w:fldChar w:fldCharType="end"/>
+            </w:r>
+          </w:hyperlink>
+        </w:p>
+        <w:p>
+          <w:pPr>
+            <w:pStyle w:val="Sommario1"/>
+            <w:tabs>
+              <w:tab w:val="right" w:leader="dot" w:pos="9062"/>
+            </w:tabs>
+            <w:rPr>
+              <w:rFonts w:asciiTheme="minorHAnsi" w:eastAsiaTheme="minorEastAsia" w:hAnsiTheme="minorHAnsi"/>
+              <w:noProof/>
+              <w:color w:val="auto"/>
+              <w:sz w:val="24"/>
+              <w:lang w:val="it-IT" w:eastAsia="it-IT"/>
+            </w:rPr>
+          </w:pPr>
+          <w:hyperlink w:anchor="_Toc232860196" w:history="1">
+            <w:r>
+              <w:rPr>
+                <w:rStyle w:val="Collegamentoipertestuale"/>
+                <w:noProof/>
+              </w:rPr>
+              <w:t>13. Roadmap Post-MVP</w:t>
+            </w:r>
+            <w:r>
+              <w:rPr>
+                <w:noProof/>
+                <w:webHidden/>
+              </w:rPr>
+              <w:tab/>
+            </w:r>
+            <w:r>
+              <w:rPr>
+                <w:noProof/>
+                <w:webHidden/>
+              </w:rPr>
+              <w:fldChar w:fldCharType="begin"/>
+            </w:r>
+            <w:r>
+              <w:rPr>
+                <w:noProof/>
+                <w:webHidden/>
+              </w:rPr>
+              <w:instrText xml:space="preserve"> PAGEREF _Toc232860196 \h </w:instrText>
+            </w:r>
+            <w:r>
+              <w:rPr>
+                <w:noProof/>
+                <w:webHidden/>
+              </w:rPr>
+            </w:r>
+            <w:r>
+              <w:rPr>
+                <w:noProof/>
+                <w:webHidden/>
+              </w:rPr>
+              <w:fldChar w:fldCharType="separate"/>
+            </w:r>
+            <w:r>
+              <w:rPr>
+                <w:noProof/>
+                <w:webHidden/>
+              </w:rPr>
+              <w:t>22</w:t>
+            </w:r>
+            <w:r>
+              <w:rPr>
+                <w:noProof/>
+                <w:webHidden/>
+              </w:rPr>
+              <w:fldChar w:fldCharType="end"/>
+            </w:r>
+          </w:hyperlink>
+        </w:p>
+        <w:p>
+          <w:r>
+            <w:rPr>
+              <w:b/>
+              <w:bCs/>
+            </w:rPr>
+            <w:fldChar w:fldCharType="end"/>
+          </w:r>
+        </w:p>
+      </w:sdtContent>
+    </w:sdt>
     <w:p/>
     <w:p>
       <w:r>
@@ -670,22 +3342,30 @@
     </w:p>
     <w:p>
       <w:pPr>
-        <w:pStyle w:val="Heading1"/>
+        <w:pStyle w:val="Titolo1"/>
       </w:pPr>
+      <w:bookmarkStart w:id="2" w:name="_Toc232860160"/>
       <w:r>
         <w:lastRenderedPageBreak/>
         <w:t>1. Executive Summary</w:t>
       </w:r>
+      <w:bookmarkEnd w:id="2"/>
     </w:p>
     <w:p>
       <w:r>
-        <w:t>Man-Agent e' una piattaforma SaaS enterprise rivolta ad aziende di servizi professionali che gestiscono portafogli di progetti a budget per conto di clienti. Il problema centrale e' la "scoperta tardiva": Project Manager e Manager si accorgono del superamento di budget o del calo di margine quando l'intervento correttivo non e' piu' possibile.</w:t>
+        <w:t>TeamFit</w:t>
+      </w:r>
+      <w:r>
+        <w:t xml:space="preserve"> e' una piattaforma SaaS enterprise rivolta ad aziende di servizi professionali che gestiscono portafogli di progetti a budget per conto di clienti. Il problema centrale e' la "scoperta tardiva": Project Manager e Manager si accorgono del superamento di budget o del calo di margine quando l'intervento correttivo non e' piu' possibile.</w:t>
       </w:r>
     </w:p>
     <w:p/>
     <w:p>
       <w:r>
-        <w:t>Man-Agent risponde con:</w:t>
+        <w:t>TeamFit</w:t>
+      </w:r>
+      <w:r>
+        <w:t xml:space="preserve"> risponde con:</w:t>
       </w:r>
     </w:p>
     <w:p>
@@ -721,20 +3401,24 @@
     </w:p>
     <w:p>
       <w:pPr>
-        <w:pStyle w:val="Heading1"/>
+        <w:pStyle w:val="Titolo1"/>
       </w:pPr>
+      <w:bookmarkStart w:id="3" w:name="_Toc232860161"/>
       <w:r>
         <w:lastRenderedPageBreak/>
         <w:t>2. Scope</w:t>
       </w:r>
+      <w:bookmarkEnd w:id="3"/>
     </w:p>
     <w:p>
       <w:pPr>
-        <w:pStyle w:val="Heading2"/>
+        <w:pStyle w:val="Titolo2"/>
       </w:pPr>
+      <w:bookmarkStart w:id="4" w:name="_Toc232860162"/>
       <w:r>
         <w:t>2.1  In Scope  -  MVP</w:t>
       </w:r>
+      <w:bookmarkEnd w:id="4"/>
     </w:p>
     <w:p>
       <w:r>
@@ -804,11 +3488,13 @@
     <w:p/>
     <w:p>
       <w:pPr>
-        <w:pStyle w:val="Heading2"/>
+        <w:pStyle w:val="Titolo2"/>
       </w:pPr>
+      <w:bookmarkStart w:id="5" w:name="_Toc232860163"/>
       <w:r>
         <w:t>2.2  Out of Scope  -  MVP</w:t>
       </w:r>
+      <w:bookmarkEnd w:id="5"/>
     </w:p>
     <w:p>
       <w:r>
@@ -868,16 +3554,18 @@
     </w:p>
     <w:p>
       <w:pPr>
-        <w:pStyle w:val="Heading1"/>
+        <w:pStyle w:val="Titolo1"/>
       </w:pPr>
+      <w:bookmarkStart w:id="6" w:name="_Toc232860164"/>
       <w:r>
         <w:lastRenderedPageBreak/>
         <w:t>3. Glossario</w:t>
       </w:r>
+      <w:bookmarkEnd w:id="6"/>
     </w:p>
     <w:tbl>
       <w:tblPr>
-        <w:tblStyle w:val="TableGrid"/>
+        <w:tblStyle w:val="Grigliatabella"/>
         <w:tblW w:w="9360" w:type="dxa"/>
         <w:tblLayout w:type="fixed"/>
         <w:tblLook w:val="04A0" w:firstRow="1" w:lastRow="0" w:firstColumn="1" w:lastColumn="0" w:noHBand="0" w:noVBand="1"/>
@@ -1503,12 +4191,14 @@
     </w:p>
     <w:p>
       <w:pPr>
-        <w:pStyle w:val="Heading1"/>
+        <w:pStyle w:val="Titolo1"/>
       </w:pPr>
+      <w:bookmarkStart w:id="7" w:name="_Toc232860165"/>
       <w:r>
         <w:lastRenderedPageBreak/>
         <w:t>4. Attori e Ruoli</w:t>
       </w:r>
+      <w:bookmarkEnd w:id="7"/>
     </w:p>
     <w:p>
       <w:r>
@@ -1518,7 +4208,7 @@
     <w:p/>
     <w:tbl>
       <w:tblPr>
-        <w:tblStyle w:val="TableGrid"/>
+        <w:tblStyle w:val="Grigliatabella"/>
         <w:tblW w:w="9360" w:type="dxa"/>
         <w:tblLayout w:type="fixed"/>
         <w:tblLook w:val="04A0" w:firstRow="1" w:lastRow="0" w:firstColumn="1" w:lastColumn="0" w:noHBand="0" w:noVBand="1"/>
@@ -1740,15 +4430,17 @@
     <w:p/>
     <w:p>
       <w:pPr>
-        <w:pStyle w:val="Heading2"/>
+        <w:pStyle w:val="Titolo2"/>
       </w:pPr>
+      <w:bookmarkStart w:id="8" w:name="_Toc232860166"/>
       <w:r>
         <w:t>4.1  Matrice permessi</w:t>
       </w:r>
+      <w:bookmarkEnd w:id="8"/>
     </w:p>
     <w:tbl>
       <w:tblPr>
-        <w:tblStyle w:val="TableGrid"/>
+        <w:tblStyle w:val="Grigliatabella"/>
         <w:tblW w:w="8928" w:type="dxa"/>
         <w:tblLayout w:type="fixed"/>
         <w:tblLook w:val="04A0" w:firstRow="1" w:lastRow="0" w:firstColumn="1" w:lastColumn="0" w:noHBand="0" w:noVBand="1"/>
@@ -2732,12 +5424,14 @@
     </w:p>
     <w:p>
       <w:pPr>
-        <w:pStyle w:val="Heading1"/>
+        <w:pStyle w:val="Titolo1"/>
       </w:pPr>
+      <w:bookmarkStart w:id="9" w:name="_Toc232860167"/>
       <w:r>
         <w:lastRenderedPageBreak/>
         <w:t>5. Requisiti Funzionali</w:t>
       </w:r>
+      <w:bookmarkEnd w:id="9"/>
     </w:p>
     <w:p>
       <w:r>
@@ -2747,7 +5441,7 @@
     <w:p/>
     <w:tbl>
       <w:tblPr>
-        <w:tblStyle w:val="TableGrid"/>
+        <w:tblStyle w:val="Grigliatabella"/>
         <w:tblW w:w="9720" w:type="dxa"/>
         <w:tblLayout w:type="fixed"/>
         <w:tblLook w:val="04A0" w:firstRow="1" w:lastRow="0" w:firstColumn="1" w:lastColumn="0" w:noHBand="0" w:noVBand="1"/>
@@ -4501,16 +7195,18 @@
     </w:p>
     <w:p>
       <w:pPr>
-        <w:pStyle w:val="Heading1"/>
+        <w:pStyle w:val="Titolo1"/>
       </w:pPr>
+      <w:bookmarkStart w:id="10" w:name="_Toc232860168"/>
       <w:r>
         <w:lastRenderedPageBreak/>
         <w:t>6. Requisiti Non Funzionali</w:t>
       </w:r>
+      <w:bookmarkEnd w:id="10"/>
     </w:p>
     <w:tbl>
       <w:tblPr>
-        <w:tblStyle w:val="TableGrid"/>
+        <w:tblStyle w:val="Grigliatabella"/>
         <w:tblW w:w="9720" w:type="dxa"/>
         <w:tblLayout w:type="fixed"/>
         <w:tblLook w:val="04A0" w:firstRow="1" w:lastRow="0" w:firstColumn="1" w:lastColumn="0" w:noHBand="0" w:noVBand="1"/>
@@ -5064,24 +7760,28 @@
     </w:p>
     <w:p>
       <w:pPr>
-        <w:pStyle w:val="Heading1"/>
+        <w:pStyle w:val="Titolo1"/>
       </w:pPr>
+      <w:bookmarkStart w:id="11" w:name="_Toc232860169"/>
       <w:r>
         <w:lastRenderedPageBreak/>
         <w:t>7. Casi d'Uso Principali</w:t>
       </w:r>
+      <w:bookmarkEnd w:id="11"/>
     </w:p>
     <w:p>
       <w:pPr>
-        <w:pStyle w:val="Heading2"/>
+        <w:pStyle w:val="Titolo2"/>
       </w:pPr>
+      <w:bookmarkStart w:id="12" w:name="_Toc232860170"/>
       <w:r>
         <w:t>UC-001  -  Login (Mock)</w:t>
       </w:r>
+      <w:bookmarkEnd w:id="12"/>
     </w:p>
     <w:tbl>
       <w:tblPr>
-        <w:tblStyle w:val="TableGrid"/>
+        <w:tblStyle w:val="Grigliatabella"/>
         <w:tblW w:w="9360" w:type="dxa"/>
         <w:tblLayout w:type="fixed"/>
         <w:tblLook w:val="04A0" w:firstRow="1" w:lastRow="0" w:firstColumn="1" w:lastColumn="0" w:noHBand="0" w:noVBand="1"/>
@@ -5361,15 +8061,17 @@
     <w:p/>
     <w:p>
       <w:pPr>
-        <w:pStyle w:val="Heading2"/>
+        <w:pStyle w:val="Titolo2"/>
       </w:pPr>
+      <w:bookmarkStart w:id="13" w:name="_Toc232860171"/>
       <w:r>
         <w:t>UC-002  -  Crea Progetto</w:t>
       </w:r>
+      <w:bookmarkEnd w:id="13"/>
     </w:p>
     <w:tbl>
       <w:tblPr>
-        <w:tblStyle w:val="TableGrid"/>
+        <w:tblStyle w:val="Grigliatabella"/>
         <w:tblW w:w="9360" w:type="dxa"/>
         <w:tblLayout w:type="fixed"/>
         <w:tblLook w:val="04A0" w:firstRow="1" w:lastRow="0" w:firstColumn="1" w:lastColumn="0" w:noHBand="0" w:noVBand="1"/>
@@ -5649,15 +8351,17 @@
     <w:p/>
     <w:p>
       <w:pPr>
-        <w:pStyle w:val="Heading2"/>
+        <w:pStyle w:val="Titolo2"/>
       </w:pPr>
+      <w:bookmarkStart w:id="14" w:name="_Toc232860172"/>
       <w:r>
         <w:t>UC-003  -  Attiva Progetto</w:t>
       </w:r>
+      <w:bookmarkEnd w:id="14"/>
     </w:p>
     <w:tbl>
       <w:tblPr>
-        <w:tblStyle w:val="TableGrid"/>
+        <w:tblStyle w:val="Grigliatabella"/>
         <w:tblW w:w="9360" w:type="dxa"/>
         <w:tblLayout w:type="fixed"/>
         <w:tblLook w:val="04A0" w:firstRow="1" w:lastRow="0" w:firstColumn="1" w:lastColumn="0" w:noHBand="0" w:noVBand="1"/>
@@ -5937,15 +8641,17 @@
     <w:p/>
     <w:p>
       <w:pPr>
-        <w:pStyle w:val="Heading2"/>
+        <w:pStyle w:val="Titolo2"/>
       </w:pPr>
+      <w:bookmarkStart w:id="15" w:name="_Toc232860173"/>
       <w:r>
         <w:t>UC-004  -  Registra Consuntivo</w:t>
       </w:r>
+      <w:bookmarkEnd w:id="15"/>
     </w:p>
     <w:tbl>
       <w:tblPr>
-        <w:tblStyle w:val="TableGrid"/>
+        <w:tblStyle w:val="Grigliatabella"/>
         <w:tblW w:w="9360" w:type="dxa"/>
         <w:tblLayout w:type="fixed"/>
         <w:tblLook w:val="04A0" w:firstRow="1" w:lastRow="0" w:firstColumn="1" w:lastColumn="0" w:noHBand="0" w:noVBand="1"/>
@@ -6225,15 +8931,17 @@
     <w:p/>
     <w:p>
       <w:pPr>
-        <w:pStyle w:val="Heading2"/>
+        <w:pStyle w:val="Titolo2"/>
       </w:pPr>
+      <w:bookmarkStart w:id="16" w:name="_Toc232860174"/>
       <w:r>
         <w:t>UC-005  -  Visualizza KPI Progetto</w:t>
       </w:r>
+      <w:bookmarkEnd w:id="16"/>
     </w:p>
     <w:tbl>
       <w:tblPr>
-        <w:tblStyle w:val="TableGrid"/>
+        <w:tblStyle w:val="Grigliatabella"/>
         <w:tblW w:w="9360" w:type="dxa"/>
         <w:tblLayout w:type="fixed"/>
         <w:tblLook w:val="04A0" w:firstRow="1" w:lastRow="0" w:firstColumn="1" w:lastColumn="0" w:noHBand="0" w:noVBand="1"/>
@@ -6513,15 +9221,17 @@
     <w:p/>
     <w:p>
       <w:pPr>
-        <w:pStyle w:val="Heading2"/>
+        <w:pStyle w:val="Titolo2"/>
       </w:pPr>
+      <w:bookmarkStart w:id="17" w:name="_Toc232860175"/>
       <w:r>
         <w:t>UC-006  -  Consulta Alert</w:t>
       </w:r>
+      <w:bookmarkEnd w:id="17"/>
     </w:p>
     <w:tbl>
       <w:tblPr>
-        <w:tblStyle w:val="TableGrid"/>
+        <w:tblStyle w:val="Grigliatabella"/>
         <w:tblW w:w="9360" w:type="dxa"/>
         <w:tblLayout w:type="fixed"/>
         <w:tblLook w:val="04A0" w:firstRow="1" w:lastRow="0" w:firstColumn="1" w:lastColumn="0" w:noHBand="0" w:noVBand="1"/>
@@ -6801,15 +9511,17 @@
     <w:p/>
     <w:p>
       <w:pPr>
-        <w:pStyle w:val="Heading2"/>
+        <w:pStyle w:val="Titolo2"/>
       </w:pPr>
+      <w:bookmarkStart w:id="18" w:name="_Toc232860176"/>
       <w:r>
         <w:t>UC-007  -  Dashboard Riepilogativa</w:t>
       </w:r>
+      <w:bookmarkEnd w:id="18"/>
     </w:p>
     <w:tbl>
       <w:tblPr>
-        <w:tblStyle w:val="TableGrid"/>
+        <w:tblStyle w:val="Grigliatabella"/>
         <w:tblW w:w="9360" w:type="dxa"/>
         <w:tblLayout w:type="fixed"/>
         <w:tblLook w:val="04A0" w:firstRow="1" w:lastRow="0" w:firstColumn="1" w:lastColumn="0" w:noHBand="0" w:noVBand="1"/>
@@ -7076,15 +9788,17 @@
     <w:p/>
     <w:p>
       <w:pPr>
-        <w:pStyle w:val="Heading2"/>
+        <w:pStyle w:val="Titolo2"/>
       </w:pPr>
+      <w:bookmarkStart w:id="19" w:name="_Toc232860177"/>
       <w:r>
         <w:t>UC-008  -  Cambio Stato Progetto</w:t>
       </w:r>
+      <w:bookmarkEnd w:id="19"/>
     </w:p>
     <w:tbl>
       <w:tblPr>
-        <w:tblStyle w:val="TableGrid"/>
+        <w:tblStyle w:val="Grigliatabella"/>
         <w:tblW w:w="9360" w:type="dxa"/>
         <w:tblLayout w:type="fixed"/>
         <w:tblLook w:val="04A0" w:firstRow="1" w:lastRow="0" w:firstColumn="1" w:lastColumn="0" w:noHBand="0" w:noVBand="1"/>
@@ -7356,12 +10070,14 @@
     </w:p>
     <w:p>
       <w:pPr>
-        <w:pStyle w:val="Heading1"/>
+        <w:pStyle w:val="Titolo1"/>
       </w:pPr>
+      <w:bookmarkStart w:id="20" w:name="_Toc232860178"/>
       <w:r>
         <w:lastRenderedPageBreak/>
         <w:t>8. Modello dei Dati</w:t>
       </w:r>
+      <w:bookmarkEnd w:id="20"/>
     </w:p>
     <w:p>
       <w:r>
@@ -7371,15 +10087,17 @@
     <w:p/>
     <w:p>
       <w:pPr>
-        <w:pStyle w:val="Heading2"/>
+        <w:pStyle w:val="Titolo2"/>
       </w:pPr>
+      <w:bookmarkStart w:id="21" w:name="_Toc232860179"/>
       <w:r>
         <w:t>Project (Aggregate Root)</w:t>
       </w:r>
+      <w:bookmarkEnd w:id="21"/>
     </w:p>
     <w:tbl>
       <w:tblPr>
-        <w:tblStyle w:val="TableGrid"/>
+        <w:tblStyle w:val="Grigliatabella"/>
         <w:tblW w:w="9360" w:type="dxa"/>
         <w:tblLayout w:type="fixed"/>
         <w:tblLook w:val="04A0" w:firstRow="1" w:lastRow="0" w:firstColumn="1" w:lastColumn="0" w:noHBand="0" w:noVBand="1"/>
@@ -8001,15 +10719,17 @@
     <w:p/>
     <w:p>
       <w:pPr>
-        <w:pStyle w:val="Heading2"/>
+        <w:pStyle w:val="Titolo2"/>
       </w:pPr>
+      <w:bookmarkStart w:id="22" w:name="_Toc232860180"/>
       <w:r>
         <w:t>Allocation (child di Project)</w:t>
       </w:r>
+      <w:bookmarkEnd w:id="22"/>
     </w:p>
     <w:tbl>
       <w:tblPr>
-        <w:tblStyle w:val="TableGrid"/>
+        <w:tblStyle w:val="Grigliatabella"/>
         <w:tblW w:w="9360" w:type="dxa"/>
         <w:tblLayout w:type="fixed"/>
         <w:tblLook w:val="04A0" w:firstRow="1" w:lastRow="0" w:firstColumn="1" w:lastColumn="0" w:noHBand="0" w:noVBand="1"/>
@@ -8311,15 +11031,17 @@
     <w:p/>
     <w:p>
       <w:pPr>
-        <w:pStyle w:val="Heading2"/>
+        <w:pStyle w:val="Titolo2"/>
       </w:pPr>
+      <w:bookmarkStart w:id="23" w:name="_Toc232860181"/>
       <w:r>
         <w:t>Customer</w:t>
       </w:r>
+      <w:bookmarkEnd w:id="23"/>
     </w:p>
     <w:tbl>
       <w:tblPr>
-        <w:tblStyle w:val="TableGrid"/>
+        <w:tblStyle w:val="Grigliatabella"/>
         <w:tblW w:w="9360" w:type="dxa"/>
         <w:tblLayout w:type="fixed"/>
         <w:tblLook w:val="04A0" w:firstRow="1" w:lastRow="0" w:firstColumn="1" w:lastColumn="0" w:noHBand="0" w:noVBand="1"/>
@@ -8621,16 +11343,18 @@
     <w:p/>
     <w:p>
       <w:pPr>
-        <w:pStyle w:val="Heading2"/>
+        <w:pStyle w:val="Titolo2"/>
       </w:pPr>
+      <w:bookmarkStart w:id="24" w:name="_Toc232860182"/>
       <w:r>
         <w:lastRenderedPageBreak/>
         <w:t>Employee</w:t>
       </w:r>
+      <w:bookmarkEnd w:id="24"/>
     </w:p>
     <w:tbl>
       <w:tblPr>
-        <w:tblStyle w:val="TableGrid"/>
+        <w:tblStyle w:val="Grigliatabella"/>
         <w:tblW w:w="9360" w:type="dxa"/>
         <w:tblLayout w:type="fixed"/>
         <w:tblLook w:val="04A0" w:firstRow="1" w:lastRow="0" w:firstColumn="1" w:lastColumn="0" w:noHBand="0" w:noVBand="1"/>
@@ -8852,15 +11576,17 @@
     <w:p/>
     <w:p>
       <w:pPr>
-        <w:pStyle w:val="Heading2"/>
+        <w:pStyle w:val="Titolo2"/>
       </w:pPr>
+      <w:bookmarkStart w:id="25" w:name="_Toc232860183"/>
       <w:r>
         <w:t>Figure</w:t>
       </w:r>
+      <w:bookmarkEnd w:id="25"/>
     </w:p>
     <w:tbl>
       <w:tblPr>
-        <w:tblStyle w:val="TableGrid"/>
+        <w:tblStyle w:val="Grigliatabella"/>
         <w:tblW w:w="9360" w:type="dxa"/>
         <w:tblLayout w:type="fixed"/>
         <w:tblLook w:val="04A0" w:firstRow="1" w:lastRow="0" w:firstColumn="1" w:lastColumn="0" w:noHBand="0" w:noVBand="1"/>
@@ -9082,15 +11808,17 @@
     <w:p/>
     <w:p>
       <w:pPr>
-        <w:pStyle w:val="Heading2"/>
+        <w:pStyle w:val="Titolo2"/>
       </w:pPr>
+      <w:bookmarkStart w:id="26" w:name="_Toc232860184"/>
       <w:r>
         <w:t>User</w:t>
       </w:r>
+      <w:bookmarkEnd w:id="26"/>
     </w:p>
     <w:tbl>
       <w:tblPr>
-        <w:tblStyle w:val="TableGrid"/>
+        <w:tblStyle w:val="Grigliatabella"/>
         <w:tblW w:w="9360" w:type="dxa"/>
         <w:tblLayout w:type="fixed"/>
         <w:tblLook w:val="04A0" w:firstRow="1" w:lastRow="0" w:firstColumn="1" w:lastColumn="0" w:noHBand="0" w:noVBand="1"/>
@@ -9357,19 +12085,24 @@
     </w:p>
     <w:p>
       <w:pPr>
-        <w:pStyle w:val="Heading1"/>
+        <w:pStyle w:val="Titolo1"/>
       </w:pPr>
+      <w:bookmarkStart w:id="27" w:name="_Toc232860185"/>
       <w:r>
+        <w:lastRenderedPageBreak/>
         <w:t>9. Regole di Business</w:t>
       </w:r>
+      <w:bookmarkEnd w:id="27"/>
     </w:p>
     <w:p>
       <w:pPr>
-        <w:pStyle w:val="Heading2"/>
+        <w:pStyle w:val="Titolo2"/>
       </w:pPr>
+      <w:bookmarkStart w:id="28" w:name="_Toc232860186"/>
       <w:r>
         <w:t>9.1  Invarianti di dominio</w:t>
       </w:r>
+      <w:bookmarkEnd w:id="28"/>
     </w:p>
     <w:p>
       <w:r>
@@ -9414,15 +12147,17 @@
     <w:p/>
     <w:p>
       <w:pPr>
-        <w:pStyle w:val="Heading2"/>
+        <w:pStyle w:val="Titolo2"/>
       </w:pPr>
+      <w:bookmarkStart w:id="29" w:name="_Toc232860187"/>
       <w:r>
         <w:t>9.2  Formule KPI</w:t>
       </w:r>
+      <w:bookmarkEnd w:id="29"/>
     </w:p>
     <w:tbl>
       <w:tblPr>
-        <w:tblStyle w:val="TableGrid"/>
+        <w:tblStyle w:val="Grigliatabella"/>
         <w:tblW w:w="9360" w:type="dxa"/>
         <w:tblLayout w:type="fixed"/>
         <w:tblLook w:val="04A0" w:firstRow="1" w:lastRow="0" w:firstColumn="1" w:lastColumn="0" w:noHBand="0" w:noVBand="1"/>
@@ -9724,11 +12459,13 @@
     <w:p/>
     <w:p>
       <w:pPr>
-        <w:pStyle w:val="Heading2"/>
+        <w:pStyle w:val="Titolo2"/>
       </w:pPr>
+      <w:bookmarkStart w:id="30" w:name="_Toc232860188"/>
       <w:r>
         <w:t>9.3  Regole di alerting</w:t>
       </w:r>
+      <w:bookmarkEnd w:id="30"/>
     </w:p>
     <w:p>
       <w:r>
@@ -9738,7 +12475,7 @@
     <w:p/>
     <w:tbl>
       <w:tblPr>
-        <w:tblStyle w:val="TableGrid"/>
+        <w:tblStyle w:val="Grigliatabella"/>
         <w:tblW w:w="9720" w:type="dxa"/>
         <w:tblLayout w:type="fixed"/>
         <w:tblLook w:val="04A0" w:firstRow="1" w:lastRow="0" w:firstColumn="1" w:lastColumn="0" w:noHBand="0" w:noVBand="1"/>
@@ -10275,6 +13012,7 @@
                 <w:color w:val="1F3864"/>
                 <w:sz w:val="18"/>
               </w:rPr>
+              <w:lastRenderedPageBreak/>
               <w:t>NO_ACTIVITY</w:t>
             </w:r>
           </w:p>
@@ -10344,23 +13082,28 @@
     </w:p>
     <w:p>
       <w:pPr>
-        <w:pStyle w:val="Heading1"/>
+        <w:pStyle w:val="Titolo1"/>
       </w:pPr>
+      <w:bookmarkStart w:id="31" w:name="_Toc232860189"/>
       <w:r>
+        <w:lastRenderedPageBreak/>
         <w:t>10. Architettura e Infrastruttura</w:t>
       </w:r>
+      <w:bookmarkEnd w:id="31"/>
     </w:p>
     <w:p>
       <w:pPr>
-        <w:pStyle w:val="Heading2"/>
+        <w:pStyle w:val="Titolo2"/>
       </w:pPr>
+      <w:bookmarkStart w:id="32" w:name="_Toc232860190"/>
       <w:r>
         <w:t>10.1  Stack tecnologico</w:t>
       </w:r>
+      <w:bookmarkEnd w:id="32"/>
     </w:p>
     <w:tbl>
       <w:tblPr>
-        <w:tblStyle w:val="TableGrid"/>
+        <w:tblStyle w:val="Grigliatabella"/>
         <w:tblW w:w="9360" w:type="dxa"/>
         <w:tblLayout w:type="fixed"/>
         <w:tblLook w:val="04A0" w:firstRow="1" w:lastRow="0" w:firstColumn="1" w:lastColumn="0" w:noHBand="0" w:noVBand="1"/>
@@ -10662,15 +13405,17 @@
     <w:p/>
     <w:p>
       <w:pPr>
-        <w:pStyle w:val="Heading2"/>
+        <w:pStyle w:val="Titolo2"/>
       </w:pPr>
+      <w:bookmarkStart w:id="33" w:name="_Toc232860191"/>
       <w:r>
         <w:t>10.2  Componenti Azure (Terraform)</w:t>
       </w:r>
+      <w:bookmarkEnd w:id="33"/>
     </w:p>
     <w:tbl>
       <w:tblPr>
-        <w:tblStyle w:val="TableGrid"/>
+        <w:tblStyle w:val="Grigliatabella"/>
         <w:tblW w:w="9360" w:type="dxa"/>
         <w:tblLayout w:type="fixed"/>
         <w:tblLook w:val="04A0" w:firstRow="1" w:lastRow="0" w:firstColumn="1" w:lastColumn="0" w:noHBand="0" w:noVBand="1"/>
@@ -10896,19 +13641,24 @@
     </w:p>
     <w:p>
       <w:pPr>
-        <w:pStyle w:val="Heading1"/>
+        <w:pStyle w:val="Titolo1"/>
       </w:pPr>
+      <w:bookmarkStart w:id="34" w:name="_Toc232860192"/>
       <w:r>
+        <w:lastRenderedPageBreak/>
         <w:t>11. Vincoli e Assunzioni</w:t>
       </w:r>
+      <w:bookmarkEnd w:id="34"/>
     </w:p>
     <w:p>
       <w:pPr>
-        <w:pStyle w:val="Heading2"/>
+        <w:pStyle w:val="Titolo2"/>
       </w:pPr>
+      <w:bookmarkStart w:id="35" w:name="_Toc232860193"/>
       <w:r>
         <w:t>11.1  Vincoli tecnici</w:t>
       </w:r>
+      <w:bookmarkEnd w:id="35"/>
     </w:p>
     <w:p>
       <w:r>
@@ -10953,11 +13703,13 @@
     <w:p/>
     <w:p>
       <w:pPr>
-        <w:pStyle w:val="Heading2"/>
+        <w:pStyle w:val="Titolo2"/>
       </w:pPr>
+      <w:bookmarkStart w:id="36" w:name="_Toc232860194"/>
       <w:r>
         <w:t>11.2  Assunzioni operative</w:t>
       </w:r>
+      <w:bookmarkEnd w:id="36"/>
     </w:p>
     <w:p>
       <w:r>
@@ -11001,15 +13753,18 @@
     </w:p>
     <w:p>
       <w:pPr>
-        <w:pStyle w:val="Heading1"/>
+        <w:pStyle w:val="Titolo1"/>
       </w:pPr>
+      <w:bookmarkStart w:id="37" w:name="_Toc232860195"/>
       <w:r>
+        <w:lastRenderedPageBreak/>
         <w:t>12. Rischi e Mitigazioni</w:t>
       </w:r>
+      <w:bookmarkEnd w:id="37"/>
     </w:p>
     <w:tbl>
       <w:tblPr>
-        <w:tblStyle w:val="TableGrid"/>
+        <w:tblStyle w:val="Grigliatabella"/>
         <w:tblW w:w="10512" w:type="dxa"/>
         <w:tblLayout w:type="fixed"/>
         <w:tblLook w:val="04A0" w:firstRow="1" w:lastRow="0" w:firstColumn="1" w:lastColumn="0" w:noHBand="0" w:noVBand="1"/>
@@ -11627,11 +14382,14 @@
     </w:p>
     <w:p>
       <w:pPr>
-        <w:pStyle w:val="Heading1"/>
+        <w:pStyle w:val="Titolo1"/>
       </w:pPr>
+      <w:bookmarkStart w:id="38" w:name="_Toc232860196"/>
       <w:r>
+        <w:lastRenderedPageBreak/>
         <w:t>13. Roadmap Post-MVP</w:t>
       </w:r>
+      <w:bookmarkEnd w:id="38"/>
     </w:p>
     <w:p>
       <w:r>
@@ -11641,7 +14399,7 @@
     <w:p/>
     <w:tbl>
       <w:tblPr>
-        <w:tblStyle w:val="TableGrid"/>
+        <w:tblStyle w:val="Grigliatabella"/>
         <w:tblW w:w="9720" w:type="dxa"/>
         <w:tblLayout w:type="fixed"/>
         <w:tblLook w:val="04A0" w:firstRow="1" w:lastRow="0" w:firstColumn="1" w:lastColumn="0" w:noHBand="0" w:noVBand="1"/>
@@ -12764,7 +15522,7 @@
     <w:lsdException w:name="Unresolved Mention" w:semiHidden="1" w:unhideWhenUsed="1"/>
     <w:lsdException w:name="Smart Link" w:semiHidden="1" w:unhideWhenUsed="1"/>
   </w:latentStyles>
-  <w:style w:type="paragraph" w:default="1" w:styleId="Normal">
+  <w:style w:type="paragraph" w:default="1" w:styleId="Normale">
     <w:name w:val="Normal"/>
     <w:qFormat/>
     <w:rPr>
@@ -12773,11 +15531,11 @@
       <w:sz w:val="22"/>
     </w:rPr>
   </w:style>
-  <w:style w:type="paragraph" w:styleId="Heading1">
+  <w:style w:type="paragraph" w:styleId="Titolo1">
     <w:name w:val="heading 1"/>
-    <w:basedOn w:val="Normal"/>
-    <w:next w:val="Normal"/>
-    <w:link w:val="Heading1Char"/>
+    <w:basedOn w:val="Normale"/>
+    <w:next w:val="Normale"/>
+    <w:link w:val="Titolo1Carattere"/>
     <w:uiPriority w:val="9"/>
     <w:qFormat/>
     <w:rsid w:val="004C5BF2"/>
@@ -12795,11 +15553,11 @@
       <w:szCs w:val="40"/>
     </w:rPr>
   </w:style>
-  <w:style w:type="paragraph" w:styleId="Heading2">
+  <w:style w:type="paragraph" w:styleId="Titolo2">
     <w:name w:val="heading 2"/>
-    <w:basedOn w:val="Normal"/>
-    <w:next w:val="Normal"/>
-    <w:link w:val="Heading2Char"/>
+    <w:basedOn w:val="Normale"/>
+    <w:next w:val="Normale"/>
+    <w:link w:val="Titolo2Carattere"/>
     <w:uiPriority w:val="9"/>
     <w:unhideWhenUsed/>
     <w:qFormat/>
@@ -12818,11 +15576,11 @@
       <w:szCs w:val="32"/>
     </w:rPr>
   </w:style>
-  <w:style w:type="paragraph" w:styleId="Heading3">
+  <w:style w:type="paragraph" w:styleId="Titolo3">
     <w:name w:val="heading 3"/>
-    <w:basedOn w:val="Normal"/>
-    <w:next w:val="Normal"/>
-    <w:link w:val="Heading3Char"/>
+    <w:basedOn w:val="Normale"/>
+    <w:next w:val="Normale"/>
+    <w:link w:val="Titolo3Carattere"/>
     <w:uiPriority w:val="9"/>
     <w:semiHidden/>
     <w:unhideWhenUsed/>
@@ -12841,11 +15599,11 @@
       <w:szCs w:val="28"/>
     </w:rPr>
   </w:style>
-  <w:style w:type="paragraph" w:styleId="Heading4">
+  <w:style w:type="paragraph" w:styleId="Titolo4">
     <w:name w:val="heading 4"/>
-    <w:basedOn w:val="Normal"/>
-    <w:next w:val="Normal"/>
-    <w:link w:val="Heading4Char"/>
+    <w:basedOn w:val="Normale"/>
+    <w:next w:val="Normale"/>
+    <w:link w:val="Titolo4Carattere"/>
     <w:uiPriority w:val="9"/>
     <w:semiHidden/>
     <w:unhideWhenUsed/>
@@ -12864,11 +15622,11 @@
       <w:color w:val="0F4761" w:themeColor="accent1" w:themeShade="BF"/>
     </w:rPr>
   </w:style>
-  <w:style w:type="paragraph" w:styleId="Heading5">
+  <w:style w:type="paragraph" w:styleId="Titolo5">
     <w:name w:val="heading 5"/>
-    <w:basedOn w:val="Normal"/>
-    <w:next w:val="Normal"/>
-    <w:link w:val="Heading5Char"/>
+    <w:basedOn w:val="Normale"/>
+    <w:next w:val="Normale"/>
+    <w:link w:val="Titolo5Carattere"/>
     <w:uiPriority w:val="9"/>
     <w:semiHidden/>
     <w:unhideWhenUsed/>
@@ -12885,11 +15643,11 @@
       <w:color w:val="0F4761" w:themeColor="accent1" w:themeShade="BF"/>
     </w:rPr>
   </w:style>
-  <w:style w:type="paragraph" w:styleId="Heading6">
+  <w:style w:type="paragraph" w:styleId="Titolo6">
     <w:name w:val="heading 6"/>
-    <w:basedOn w:val="Normal"/>
-    <w:next w:val="Normal"/>
-    <w:link w:val="Heading6Char"/>
+    <w:basedOn w:val="Normale"/>
+    <w:next w:val="Normale"/>
+    <w:link w:val="Titolo6Carattere"/>
     <w:uiPriority w:val="9"/>
     <w:semiHidden/>
     <w:unhideWhenUsed/>
@@ -12908,11 +15666,11 @@
       <w:color w:val="595959" w:themeColor="text1" w:themeTint="A6"/>
     </w:rPr>
   </w:style>
-  <w:style w:type="paragraph" w:styleId="Heading7">
+  <w:style w:type="paragraph" w:styleId="Titolo7">
     <w:name w:val="heading 7"/>
-    <w:basedOn w:val="Normal"/>
-    <w:next w:val="Normal"/>
-    <w:link w:val="Heading7Char"/>
+    <w:basedOn w:val="Normale"/>
+    <w:next w:val="Normale"/>
+    <w:link w:val="Titolo7Carattere"/>
     <w:uiPriority w:val="9"/>
     <w:semiHidden/>
     <w:unhideWhenUsed/>
@@ -12929,11 +15687,11 @@
       <w:color w:val="595959" w:themeColor="text1" w:themeTint="A6"/>
     </w:rPr>
   </w:style>
-  <w:style w:type="paragraph" w:styleId="Heading8">
+  <w:style w:type="paragraph" w:styleId="Titolo8">
     <w:name w:val="heading 8"/>
-    <w:basedOn w:val="Normal"/>
-    <w:next w:val="Normal"/>
-    <w:link w:val="Heading8Char"/>
+    <w:basedOn w:val="Normale"/>
+    <w:next w:val="Normale"/>
+    <w:link w:val="Titolo8Carattere"/>
     <w:uiPriority w:val="9"/>
     <w:semiHidden/>
     <w:unhideWhenUsed/>
@@ -12952,11 +15710,11 @@
       <w:color w:val="272727" w:themeColor="text1" w:themeTint="D8"/>
     </w:rPr>
   </w:style>
-  <w:style w:type="paragraph" w:styleId="Heading9">
+  <w:style w:type="paragraph" w:styleId="Titolo9">
     <w:name w:val="heading 9"/>
-    <w:basedOn w:val="Normal"/>
-    <w:next w:val="Normal"/>
-    <w:link w:val="Heading9Char"/>
+    <w:basedOn w:val="Normale"/>
+    <w:next w:val="Normale"/>
+    <w:link w:val="Titolo9Carattere"/>
     <w:uiPriority w:val="9"/>
     <w:semiHidden/>
     <w:unhideWhenUsed/>
@@ -12973,13 +15731,13 @@
       <w:color w:val="272727" w:themeColor="text1" w:themeTint="D8"/>
     </w:rPr>
   </w:style>
-  <w:style w:type="character" w:default="1" w:styleId="DefaultParagraphFont">
+  <w:style w:type="character" w:default="1" w:styleId="Carpredefinitoparagrafo">
     <w:name w:val="Default Paragraph Font"/>
     <w:uiPriority w:val="1"/>
     <w:semiHidden/>
     <w:unhideWhenUsed/>
   </w:style>
-  <w:style w:type="table" w:default="1" w:styleId="TableNormal">
+  <w:style w:type="table" w:default="1" w:styleId="Tabellanormale">
     <w:name w:val="Normal Table"/>
     <w:uiPriority w:val="99"/>
     <w:semiHidden/>
@@ -12994,16 +15752,16 @@
       </w:tblCellMar>
     </w:tblPr>
   </w:style>
-  <w:style w:type="numbering" w:default="1" w:styleId="NoList">
+  <w:style w:type="numbering" w:default="1" w:styleId="Nessunelenco">
     <w:name w:val="No List"/>
     <w:uiPriority w:val="99"/>
     <w:semiHidden/>
     <w:unhideWhenUsed/>
   </w:style>
-  <w:style w:type="character" w:customStyle="1" w:styleId="Heading1Char">
-    <w:name w:val="Heading 1 Char"/>
-    <w:basedOn w:val="DefaultParagraphFont"/>
-    <w:link w:val="Heading1"/>
+  <w:style w:type="character" w:customStyle="1" w:styleId="Titolo1Carattere">
+    <w:name w:val="Titolo 1 Carattere"/>
+    <w:basedOn w:val="Carpredefinitoparagrafo"/>
+    <w:link w:val="Titolo1"/>
     <w:uiPriority w:val="9"/>
     <w:rsid w:val="004C5BF2"/>
     <w:rPr>
@@ -13014,10 +15772,10 @@
       <w:szCs w:val="40"/>
     </w:rPr>
   </w:style>
-  <w:style w:type="character" w:customStyle="1" w:styleId="Heading2Char">
-    <w:name w:val="Heading 2 Char"/>
-    <w:basedOn w:val="DefaultParagraphFont"/>
-    <w:link w:val="Heading2"/>
+  <w:style w:type="character" w:customStyle="1" w:styleId="Titolo2Carattere">
+    <w:name w:val="Titolo 2 Carattere"/>
+    <w:basedOn w:val="Carpredefinitoparagrafo"/>
+    <w:link w:val="Titolo2"/>
     <w:uiPriority w:val="9"/>
     <w:rsid w:val="004C5BF2"/>
     <w:rPr>
@@ -13028,10 +15786,10 @@
       <w:szCs w:val="32"/>
     </w:rPr>
   </w:style>
-  <w:style w:type="character" w:customStyle="1" w:styleId="Heading3Char">
-    <w:name w:val="Heading 3 Char"/>
-    <w:basedOn w:val="DefaultParagraphFont"/>
-    <w:link w:val="Heading3"/>
+  <w:style w:type="character" w:customStyle="1" w:styleId="Titolo3Carattere">
+    <w:name w:val="Titolo 3 Carattere"/>
+    <w:basedOn w:val="Carpredefinitoparagrafo"/>
+    <w:link w:val="Titolo3"/>
     <w:uiPriority w:val="9"/>
     <w:semiHidden/>
     <w:rsid w:val="004C5BF2"/>
@@ -13043,10 +15801,10 @@
       <w:szCs w:val="28"/>
     </w:rPr>
   </w:style>
-  <w:style w:type="character" w:customStyle="1" w:styleId="Heading4Char">
-    <w:name w:val="Heading 4 Char"/>
-    <w:basedOn w:val="DefaultParagraphFont"/>
-    <w:link w:val="Heading4"/>
+  <w:style w:type="character" w:customStyle="1" w:styleId="Titolo4Carattere">
+    <w:name w:val="Titolo 4 Carattere"/>
+    <w:basedOn w:val="Carpredefinitoparagrafo"/>
+    <w:link w:val="Titolo4"/>
     <w:uiPriority w:val="9"/>
     <w:semiHidden/>
     <w:rsid w:val="004C5BF2"/>
@@ -13057,10 +15815,10 @@
       <w:color w:val="0F4761" w:themeColor="accent1" w:themeShade="BF"/>
     </w:rPr>
   </w:style>
-  <w:style w:type="character" w:customStyle="1" w:styleId="Heading5Char">
-    <w:name w:val="Heading 5 Char"/>
-    <w:basedOn w:val="DefaultParagraphFont"/>
-    <w:link w:val="Heading5"/>
+  <w:style w:type="character" w:customStyle="1" w:styleId="Titolo5Carattere">
+    <w:name w:val="Titolo 5 Carattere"/>
+    <w:basedOn w:val="Carpredefinitoparagrafo"/>
+    <w:link w:val="Titolo5"/>
     <w:uiPriority w:val="9"/>
     <w:semiHidden/>
     <w:rsid w:val="004C5BF2"/>
@@ -13069,10 +15827,10 @@
       <w:color w:val="0F4761" w:themeColor="accent1" w:themeShade="BF"/>
     </w:rPr>
   </w:style>
-  <w:style w:type="character" w:customStyle="1" w:styleId="Heading6Char">
-    <w:name w:val="Heading 6 Char"/>
-    <w:basedOn w:val="DefaultParagraphFont"/>
-    <w:link w:val="Heading6"/>
+  <w:style w:type="character" w:customStyle="1" w:styleId="Titolo6Carattere">
+    <w:name w:val="Titolo 6 Carattere"/>
+    <w:basedOn w:val="Carpredefinitoparagrafo"/>
+    <w:link w:val="Titolo6"/>
     <w:uiPriority w:val="9"/>
     <w:semiHidden/>
     <w:rsid w:val="004C5BF2"/>
@@ -13083,10 +15841,10 @@
       <w:color w:val="595959" w:themeColor="text1" w:themeTint="A6"/>
     </w:rPr>
   </w:style>
-  <w:style w:type="character" w:customStyle="1" w:styleId="Heading7Char">
-    <w:name w:val="Heading 7 Char"/>
-    <w:basedOn w:val="DefaultParagraphFont"/>
-    <w:link w:val="Heading7"/>
+  <w:style w:type="character" w:customStyle="1" w:styleId="Titolo7Carattere">
+    <w:name w:val="Titolo 7 Carattere"/>
+    <w:basedOn w:val="Carpredefinitoparagrafo"/>
+    <w:link w:val="Titolo7"/>
     <w:uiPriority w:val="9"/>
     <w:semiHidden/>
     <w:rsid w:val="004C5BF2"/>
@@ -13095,10 +15853,10 @@
       <w:color w:val="595959" w:themeColor="text1" w:themeTint="A6"/>
     </w:rPr>
   </w:style>
-  <w:style w:type="character" w:customStyle="1" w:styleId="Heading8Char">
-    <w:name w:val="Heading 8 Char"/>
-    <w:basedOn w:val="DefaultParagraphFont"/>
-    <w:link w:val="Heading8"/>
+  <w:style w:type="character" w:customStyle="1" w:styleId="Titolo8Carattere">
+    <w:name w:val="Titolo 8 Carattere"/>
+    <w:basedOn w:val="Carpredefinitoparagrafo"/>
+    <w:link w:val="Titolo8"/>
     <w:uiPriority w:val="9"/>
     <w:semiHidden/>
     <w:rsid w:val="004C5BF2"/>
@@ -13109,10 +15867,10 @@
       <w:color w:val="272727" w:themeColor="text1" w:themeTint="D8"/>
     </w:rPr>
   </w:style>
-  <w:style w:type="character" w:customStyle="1" w:styleId="Heading9Char">
-    <w:name w:val="Heading 9 Char"/>
-    <w:basedOn w:val="DefaultParagraphFont"/>
-    <w:link w:val="Heading9"/>
+  <w:style w:type="character" w:customStyle="1" w:styleId="Titolo9Carattere">
+    <w:name w:val="Titolo 9 Carattere"/>
+    <w:basedOn w:val="Carpredefinitoparagrafo"/>
+    <w:link w:val="Titolo9"/>
     <w:uiPriority w:val="9"/>
     <w:semiHidden/>
     <w:rsid w:val="004C5BF2"/>
@@ -13121,11 +15879,11 @@
       <w:color w:val="272727" w:themeColor="text1" w:themeTint="D8"/>
     </w:rPr>
   </w:style>
-  <w:style w:type="paragraph" w:styleId="Title">
+  <w:style w:type="paragraph" w:styleId="Titolo">
     <w:name w:val="Title"/>
-    <w:basedOn w:val="Normal"/>
-    <w:next w:val="Normal"/>
-    <w:link w:val="TitleChar"/>
+    <w:basedOn w:val="Normale"/>
+    <w:next w:val="Normale"/>
+    <w:link w:val="TitoloCarattere"/>
     <w:uiPriority w:val="10"/>
     <w:qFormat/>
     <w:rsid w:val="004C5BF2"/>
@@ -13141,10 +15899,10 @@
       <w:szCs w:val="56"/>
     </w:rPr>
   </w:style>
-  <w:style w:type="character" w:customStyle="1" w:styleId="TitleChar">
-    <w:name w:val="Title Char"/>
-    <w:basedOn w:val="DefaultParagraphFont"/>
-    <w:link w:val="Title"/>
+  <w:style w:type="character" w:customStyle="1" w:styleId="TitoloCarattere">
+    <w:name w:val="Titolo Carattere"/>
+    <w:basedOn w:val="Carpredefinitoparagrafo"/>
+    <w:link w:val="Titolo"/>
     <w:uiPriority w:val="10"/>
     <w:rsid w:val="004C5BF2"/>
     <w:rPr>
@@ -13155,11 +15913,11 @@
       <w:szCs w:val="56"/>
     </w:rPr>
   </w:style>
-  <w:style w:type="paragraph" w:styleId="Subtitle">
+  <w:style w:type="paragraph" w:styleId="Sottotitolo">
     <w:name w:val="Subtitle"/>
-    <w:basedOn w:val="Normal"/>
-    <w:next w:val="Normal"/>
-    <w:link w:val="SubtitleChar"/>
+    <w:basedOn w:val="Normale"/>
+    <w:next w:val="Normale"/>
+    <w:link w:val="SottotitoloCarattere"/>
     <w:uiPriority w:val="11"/>
     <w:qFormat/>
     <w:rsid w:val="004C5BF2"/>
@@ -13176,10 +15934,10 @@
       <w:szCs w:val="28"/>
     </w:rPr>
   </w:style>
-  <w:style w:type="character" w:customStyle="1" w:styleId="SubtitleChar">
-    <w:name w:val="Subtitle Char"/>
-    <w:basedOn w:val="DefaultParagraphFont"/>
-    <w:link w:val="Subtitle"/>
+  <w:style w:type="character" w:customStyle="1" w:styleId="SottotitoloCarattere">
+    <w:name w:val="Sottotitolo Carattere"/>
+    <w:basedOn w:val="Carpredefinitoparagrafo"/>
+    <w:link w:val="Sottotitolo"/>
     <w:uiPriority w:val="11"/>
     <w:rsid w:val="004C5BF2"/>
     <w:rPr>
@@ -13190,11 +15948,11 @@
       <w:szCs w:val="28"/>
     </w:rPr>
   </w:style>
-  <w:style w:type="paragraph" w:styleId="Quote">
+  <w:style w:type="paragraph" w:styleId="Citazione">
     <w:name w:val="Quote"/>
-    <w:basedOn w:val="Normal"/>
-    <w:next w:val="Normal"/>
-    <w:link w:val="QuoteChar"/>
+    <w:basedOn w:val="Normale"/>
+    <w:next w:val="Normale"/>
+    <w:link w:val="CitazioneCarattere"/>
     <w:uiPriority w:val="29"/>
     <w:qFormat/>
     <w:rsid w:val="004C5BF2"/>
@@ -13208,10 +15966,10 @@
       <w:color w:val="404040" w:themeColor="text1" w:themeTint="BF"/>
     </w:rPr>
   </w:style>
-  <w:style w:type="character" w:customStyle="1" w:styleId="QuoteChar">
-    <w:name w:val="Quote Char"/>
-    <w:basedOn w:val="DefaultParagraphFont"/>
-    <w:link w:val="Quote"/>
+  <w:style w:type="character" w:customStyle="1" w:styleId="CitazioneCarattere">
+    <w:name w:val="Citazione Carattere"/>
+    <w:basedOn w:val="Carpredefinitoparagrafo"/>
+    <w:link w:val="Citazione"/>
     <w:uiPriority w:val="29"/>
     <w:rsid w:val="004C5BF2"/>
     <w:rPr>
@@ -13220,9 +15978,9 @@
       <w:color w:val="404040" w:themeColor="text1" w:themeTint="BF"/>
     </w:rPr>
   </w:style>
-  <w:style w:type="paragraph" w:styleId="ListParagraph">
+  <w:style w:type="paragraph" w:styleId="Paragrafoelenco">
     <w:name w:val="List Paragraph"/>
-    <w:basedOn w:val="Normal"/>
+    <w:basedOn w:val="Normale"/>
     <w:uiPriority w:val="34"/>
     <w:qFormat/>
     <w:rsid w:val="004C5BF2"/>
@@ -13231,9 +15989,9 @@
       <w:contextualSpacing/>
     </w:pPr>
   </w:style>
-  <w:style w:type="character" w:styleId="IntenseEmphasis">
+  <w:style w:type="character" w:styleId="Enfasiintensa">
     <w:name w:val="Intense Emphasis"/>
-    <w:basedOn w:val="DefaultParagraphFont"/>
+    <w:basedOn w:val="Carpredefinitoparagrafo"/>
     <w:uiPriority w:val="21"/>
     <w:qFormat/>
     <w:rsid w:val="004C5BF2"/>
@@ -13243,11 +16001,11 @@
       <w:color w:val="0F4761" w:themeColor="accent1" w:themeShade="BF"/>
     </w:rPr>
   </w:style>
-  <w:style w:type="paragraph" w:styleId="IntenseQuote">
+  <w:style w:type="paragraph" w:styleId="Citazioneintensa">
     <w:name w:val="Intense Quote"/>
-    <w:basedOn w:val="Normal"/>
-    <w:next w:val="Normal"/>
-    <w:link w:val="IntenseQuoteChar"/>
+    <w:basedOn w:val="Normale"/>
+    <w:next w:val="Normale"/>
+    <w:link w:val="CitazioneintensaCarattere"/>
     <w:uiPriority w:val="30"/>
     <w:qFormat/>
     <w:rsid w:val="004C5BF2"/>
@@ -13266,10 +16024,10 @@
       <w:color w:val="0F4761" w:themeColor="accent1" w:themeShade="BF"/>
     </w:rPr>
   </w:style>
-  <w:style w:type="character" w:customStyle="1" w:styleId="IntenseQuoteChar">
-    <w:name w:val="Intense Quote Char"/>
-    <w:basedOn w:val="DefaultParagraphFont"/>
-    <w:link w:val="IntenseQuote"/>
+  <w:style w:type="character" w:customStyle="1" w:styleId="CitazioneintensaCarattere">
+    <w:name w:val="Citazione intensa Carattere"/>
+    <w:basedOn w:val="Carpredefinitoparagrafo"/>
+    <w:link w:val="Citazioneintensa"/>
     <w:uiPriority w:val="30"/>
     <w:rsid w:val="004C5BF2"/>
     <w:rPr>
@@ -13278,9 +16036,9 @@
       <w:color w:val="0F4761" w:themeColor="accent1" w:themeShade="BF"/>
     </w:rPr>
   </w:style>
-  <w:style w:type="character" w:styleId="IntenseReference">
+  <w:style w:type="character" w:styleId="Riferimentointenso">
     <w:name w:val="Intense Reference"/>
-    <w:basedOn w:val="DefaultParagraphFont"/>
+    <w:basedOn w:val="Carpredefinitoparagrafo"/>
     <w:uiPriority w:val="32"/>
     <w:qFormat/>
     <w:rsid w:val="004C5BF2"/>
@@ -13292,9 +16050,9 @@
       <w:spacing w:val="5"/>
     </w:rPr>
   </w:style>
-  <w:style w:type="table" w:styleId="TableGrid">
+  <w:style w:type="table" w:styleId="Grigliatabella">
     <w:name w:val="Table Grid"/>
-    <w:basedOn w:val="TableNormal"/>
+    <w:basedOn w:val="Tabellanormale"/>
     <w:uiPriority w:val="39"/>
     <w:rsid w:val="004C5BF2"/>
     <w:pPr>
@@ -13311,10 +16069,10 @@
       </w:tblBorders>
     </w:tblPr>
   </w:style>
-  <w:style w:type="paragraph" w:styleId="TOC1">
+  <w:style w:type="paragraph" w:styleId="Sommario1">
     <w:name w:val="toc 1"/>
-    <w:basedOn w:val="Normal"/>
-    <w:next w:val="Normal"/>
+    <w:basedOn w:val="Normale"/>
+    <w:next w:val="Normale"/>
     <w:autoRedefine/>
     <w:uiPriority w:val="39"/>
     <w:unhideWhenUsed/>
@@ -13322,6 +16080,52 @@
     <w:pPr>
       <w:spacing w:after="100"/>
     </w:pPr>
+  </w:style>
+  <w:style w:type="paragraph" w:styleId="Titolosommario">
+    <w:name w:val="TOC Heading"/>
+    <w:basedOn w:val="Titolo1"/>
+    <w:next w:val="Normale"/>
+    <w:uiPriority w:val="39"/>
+    <w:unhideWhenUsed/>
+    <w:qFormat/>
+    <w:rsid w:val="005C0E6A"/>
+    <w:pPr>
+      <w:spacing w:before="240" w:after="0" w:line="259" w:lineRule="auto"/>
+      <w:outlineLvl w:val="9"/>
+    </w:pPr>
+    <w:rPr>
+      <w:rFonts w:asciiTheme="majorHAnsi" w:hAnsiTheme="majorHAnsi"/>
+      <w:b w:val="0"/>
+      <w:color w:val="0F4761" w:themeColor="accent1" w:themeShade="BF"/>
+      <w:kern w:val="0"/>
+      <w:szCs w:val="32"/>
+      <w:lang w:val="it-IT" w:eastAsia="it-IT"/>
+      <w14:ligatures w14:val="none"/>
+    </w:rPr>
+  </w:style>
+  <w:style w:type="paragraph" w:styleId="Sommario2">
+    <w:name w:val="toc 2"/>
+    <w:basedOn w:val="Normale"/>
+    <w:next w:val="Normale"/>
+    <w:autoRedefine/>
+    <w:uiPriority w:val="39"/>
+    <w:unhideWhenUsed/>
+    <w:rsid w:val="005C0E6A"/>
+    <w:pPr>
+      <w:spacing w:after="100"/>
+      <w:ind w:left="220"/>
+    </w:pPr>
+  </w:style>
+  <w:style w:type="character" w:styleId="Collegamentoipertestuale">
+    <w:name w:val="Hyperlink"/>
+    <w:basedOn w:val="Carpredefinitoparagrafo"/>
+    <w:uiPriority w:val="99"/>
+    <w:unhideWhenUsed/>
+    <w:rsid w:val="005C0E6A"/>
+    <w:rPr>
+      <w:color w:val="467886" w:themeColor="hyperlink"/>
+      <w:u w:val="single"/>
+    </w:rPr>
   </w:style>
 </w:styles>
 </file>

</xml_diff>